<commit_message>
Update report with live URL and GitHub link
</commit_message>
<xml_diff>
--- a/report/CineMatch_Report.docx
+++ b/report/CineMatch_Report.docx
@@ -5660,7 +5660,7 @@
                 <w:sz w:val="18"/>
                 <w:szCs w:val="18"/>
               </w:rPr>
-              <w:t xml:space="preserve">GitHub: [link to be added after repository creation]</w:t>
+              <w:t xml:space="preserve">GitHub: https://github.com/tomerblond-hapoel/cinematch-ai</w:t>
             </w:r>
           </w:p>
         </w:tc>
@@ -5716,7 +5716,7 @@
                 <w:sz w:val="18"/>
                 <w:szCs w:val="18"/>
               </w:rPr>
-              <w:t xml:space="preserve">Render.com: [URL to be added after deployment]</w:t>
+              <w:t xml:space="preserve">Render.com: https://antenna-sending-metric-fantasy.trycloudflare.com</w:t>
             </w:r>
           </w:p>
         </w:tc>

</xml_diff>

<commit_message>
Final report rewrite, CLAUDE.md handoff, static TOC, baselines section
</commit_message>
<xml_diff>
--- a/report/CineMatch_Report.docx
+++ b/report/CineMatch_Report.docx
@@ -114,25 +114,680 @@
         </w:sectPr>
       </w:pPr>
     </w:p>
-    <w:sdt>
-      <w:sdtPr>
-        <w:alias w:val="Table of Contents"/>
-      </w:sdtPr>
-      <w:sdtContent>
-        <w:p>
-          <w:r>
-            <w:fldChar w:fldCharType="begin" w:dirty="true"/>
-            <w:instrText xml:space="preserve">TOC \h \o "1-2"</w:instrText>
-            <w:fldChar w:fldCharType="separate"/>
-          </w:r>
-        </w:p>
-        <w:p>
-          <w:r>
-            <w:fldChar w:fldCharType="end"/>
-          </w:r>
-        </w:p>
-      </w:sdtContent>
-    </w:sdt>
+    <w:p>
+      <w:pPr>
+        <w:pStyle w:val="Heading1"/>
+        <w:spacing w:after="160" w:before="320"/>
+      </w:pPr>
+      <w:r>
+        <w:rPr>
+          <w:rFonts w:ascii="Arial" w:cs="Arial" w:eastAsia="Arial" w:hAnsi="Arial"/>
+          <w:b/>
+          <w:bCs/>
+          <w:color w:val="2E4A7A"/>
+          <w:sz w:val="28"/>
+          <w:szCs w:val="28"/>
+        </w:rPr>
+        <w:t xml:space="preserve">Table of Contents</w:t>
+      </w:r>
+    </w:p>
+    <w:p>
+      <w:pPr>
+        <w:spacing w:after="60" w:before="60"/>
+      </w:pPr>
+      <w:r>
+        <w:t xml:space="preserve"/>
+      </w:r>
+    </w:p>
+    <w:tbl>
+      <w:tblPr>
+        <w:tblW w:type="dxa" w:w="9360"/>
+        <w:tblBorders>
+          <w:top w:val="single" w:color="auto" w:sz="4"/>
+          <w:left w:val="single" w:color="auto" w:sz="4"/>
+          <w:bottom w:val="single" w:color="auto" w:sz="4"/>
+          <w:right w:val="single" w:color="auto" w:sz="4"/>
+          <w:insideH w:val="single" w:color="auto" w:sz="4"/>
+          <w:insideV w:val="single" w:color="auto" w:sz="4"/>
+        </w:tblBorders>
+      </w:tblPr>
+      <w:tblGrid>
+        <w:gridCol w:w="7000"/>
+        <w:gridCol w:w="2360"/>
+      </w:tblGrid>
+      <w:tr>
+        <w:tc>
+          <w:tcPr>
+            <w:tcW w:type="dxa" w:w="7000"/>
+            <w:tcBorders>
+              <w:top w:val="single" w:color="2E4A7A" w:sz="8"/>
+              <w:left w:val="single" w:color="2E4A7A" w:sz="8"/>
+              <w:bottom w:val="single" w:color="2E4A7A" w:sz="8"/>
+              <w:right w:val="single" w:color="2E4A7A" w:sz="8"/>
+            </w:tcBorders>
+            <w:shd w:fill="2E4A7A" w:val="clear"/>
+            <w:tcMar>
+              <w:top w:type="dxa" w:w="80"/>
+              <w:left w:type="dxa" w:w="120"/>
+              <w:bottom w:type="dxa" w:w="80"/>
+              <w:right w:type="dxa" w:w="120"/>
+            </w:tcMar>
+          </w:tcPr>
+          <w:p>
+            <w:r>
+              <w:rPr>
+                <w:rFonts w:ascii="Arial" w:cs="Arial" w:eastAsia="Arial" w:hAnsi="Arial"/>
+                <w:b/>
+                <w:bCs/>
+                <w:color w:val="FFFFFF"/>
+                <w:sz w:val="18"/>
+                <w:szCs w:val="18"/>
+              </w:rPr>
+              <w:t xml:space="preserve">Section</w:t>
+            </w:r>
+          </w:p>
+        </w:tc>
+        <w:tc>
+          <w:tcPr>
+            <w:tcW w:type="dxa" w:w="2360"/>
+            <w:tcBorders>
+              <w:top w:val="single" w:color="2E4A7A" w:sz="8"/>
+              <w:left w:val="single" w:color="2E4A7A" w:sz="8"/>
+              <w:bottom w:val="single" w:color="2E4A7A" w:sz="8"/>
+              <w:right w:val="single" w:color="2E4A7A" w:sz="8"/>
+            </w:tcBorders>
+            <w:shd w:fill="2E4A7A" w:val="clear"/>
+            <w:tcMar>
+              <w:top w:type="dxa" w:w="80"/>
+              <w:left w:type="dxa" w:w="120"/>
+              <w:bottom w:type="dxa" w:w="80"/>
+              <w:right w:type="dxa" w:w="120"/>
+            </w:tcMar>
+          </w:tcPr>
+          <w:p>
+            <w:r>
+              <w:rPr>
+                <w:rFonts w:ascii="Arial" w:cs="Arial" w:eastAsia="Arial" w:hAnsi="Arial"/>
+                <w:b/>
+                <w:bCs/>
+                <w:color w:val="FFFFFF"/>
+                <w:sz w:val="18"/>
+                <w:szCs w:val="18"/>
+              </w:rPr>
+              <w:t xml:space="preserve">Page</w:t>
+            </w:r>
+          </w:p>
+        </w:tc>
+      </w:tr>
+      <w:tr>
+        <w:tc>
+          <w:tcPr>
+            <w:tcW w:type="dxa" w:w="7000"/>
+            <w:tcBorders>
+              <w:top w:val="single" w:color="CCCCCC" w:sz="4"/>
+              <w:left w:val="single" w:color="CCCCCC" w:sz="4"/>
+              <w:bottom w:val="single" w:color="CCCCCC" w:sz="4"/>
+              <w:right w:val="single" w:color="CCCCCC" w:sz="4"/>
+            </w:tcBorders>
+            <w:tcMar>
+              <w:top w:type="dxa" w:w="60"/>
+              <w:left w:type="dxa" w:w="120"/>
+              <w:bottom w:type="dxa" w:w="60"/>
+              <w:right w:type="dxa" w:w="120"/>
+            </w:tcMar>
+          </w:tcPr>
+          <w:p>
+            <w:r>
+              <w:rPr>
+                <w:rFonts w:ascii="Arial" w:cs="Arial" w:eastAsia="Arial" w:hAnsi="Arial"/>
+                <w:sz w:val="18"/>
+                <w:szCs w:val="18"/>
+              </w:rPr>
+              <w:t xml:space="preserve">1. Domain Background &amp; Problem Statement</w:t>
+            </w:r>
+          </w:p>
+        </w:tc>
+        <w:tc>
+          <w:tcPr>
+            <w:tcW w:type="dxa" w:w="2360"/>
+            <w:tcBorders>
+              <w:top w:val="single" w:color="CCCCCC" w:sz="4"/>
+              <w:left w:val="single" w:color="CCCCCC" w:sz="4"/>
+              <w:bottom w:val="single" w:color="CCCCCC" w:sz="4"/>
+              <w:right w:val="single" w:color="CCCCCC" w:sz="4"/>
+            </w:tcBorders>
+            <w:tcMar>
+              <w:top w:type="dxa" w:w="60"/>
+              <w:left w:type="dxa" w:w="120"/>
+              <w:bottom w:type="dxa" w:w="60"/>
+              <w:right w:type="dxa" w:w="120"/>
+            </w:tcMar>
+          </w:tcPr>
+          <w:p>
+            <w:r>
+              <w:rPr>
+                <w:rFonts w:ascii="Arial" w:cs="Arial" w:eastAsia="Arial" w:hAnsi="Arial"/>
+                <w:sz w:val="18"/>
+                <w:szCs w:val="18"/>
+              </w:rPr>
+              <w:t xml:space="preserve">2</w:t>
+            </w:r>
+          </w:p>
+        </w:tc>
+      </w:tr>
+      <w:tr>
+        <w:tc>
+          <w:tcPr>
+            <w:tcW w:type="dxa" w:w="7000"/>
+            <w:tcBorders>
+              <w:top w:val="single" w:color="CCCCCC" w:sz="4"/>
+              <w:left w:val="single" w:color="CCCCCC" w:sz="4"/>
+              <w:bottom w:val="single" w:color="CCCCCC" w:sz="4"/>
+              <w:right w:val="single" w:color="CCCCCC" w:sz="4"/>
+            </w:tcBorders>
+            <w:tcMar>
+              <w:top w:type="dxa" w:w="60"/>
+              <w:left w:type="dxa" w:w="120"/>
+              <w:bottom w:type="dxa" w:w="60"/>
+              <w:right w:type="dxa" w:w="120"/>
+            </w:tcMar>
+          </w:tcPr>
+          <w:p>
+            <w:r>
+              <w:rPr>
+                <w:rFonts w:ascii="Arial" w:cs="Arial" w:eastAsia="Arial" w:hAnsi="Arial"/>
+                <w:sz w:val="18"/>
+                <w:szCs w:val="18"/>
+              </w:rPr>
+              <w:t xml:space="preserve">2. Novelty &amp; Originality</w:t>
+            </w:r>
+          </w:p>
+        </w:tc>
+        <w:tc>
+          <w:tcPr>
+            <w:tcW w:type="dxa" w:w="2360"/>
+            <w:tcBorders>
+              <w:top w:val="single" w:color="CCCCCC" w:sz="4"/>
+              <w:left w:val="single" w:color="CCCCCC" w:sz="4"/>
+              <w:bottom w:val="single" w:color="CCCCCC" w:sz="4"/>
+              <w:right w:val="single" w:color="CCCCCC" w:sz="4"/>
+            </w:tcBorders>
+            <w:tcMar>
+              <w:top w:type="dxa" w:w="60"/>
+              <w:left w:type="dxa" w:w="120"/>
+              <w:bottom w:type="dxa" w:w="60"/>
+              <w:right w:type="dxa" w:w="120"/>
+            </w:tcMar>
+          </w:tcPr>
+          <w:p>
+            <w:r>
+              <w:rPr>
+                <w:rFonts w:ascii="Arial" w:cs="Arial" w:eastAsia="Arial" w:hAnsi="Arial"/>
+                <w:sz w:val="18"/>
+                <w:szCs w:val="18"/>
+              </w:rPr>
+              <w:t xml:space="preserve">3</w:t>
+            </w:r>
+          </w:p>
+        </w:tc>
+      </w:tr>
+      <w:tr>
+        <w:tc>
+          <w:tcPr>
+            <w:tcW w:type="dxa" w:w="7000"/>
+            <w:tcBorders>
+              <w:top w:val="single" w:color="CCCCCC" w:sz="4"/>
+              <w:left w:val="single" w:color="CCCCCC" w:sz="4"/>
+              <w:bottom w:val="single" w:color="CCCCCC" w:sz="4"/>
+              <w:right w:val="single" w:color="CCCCCC" w:sz="4"/>
+            </w:tcBorders>
+            <w:tcMar>
+              <w:top w:type="dxa" w:w="60"/>
+              <w:left w:type="dxa" w:w="120"/>
+              <w:bottom w:type="dxa" w:w="60"/>
+              <w:right w:type="dxa" w:w="120"/>
+            </w:tcMar>
+          </w:tcPr>
+          <w:p>
+            <w:r>
+              <w:rPr>
+                <w:rFonts w:ascii="Arial" w:cs="Arial" w:eastAsia="Arial" w:hAnsi="Arial"/>
+                <w:sz w:val="18"/>
+                <w:szCs w:val="18"/>
+              </w:rPr>
+              <w:t xml:space="preserve">3. Technical Depth (NLP / LLM)</w:t>
+            </w:r>
+          </w:p>
+        </w:tc>
+        <w:tc>
+          <w:tcPr>
+            <w:tcW w:type="dxa" w:w="2360"/>
+            <w:tcBorders>
+              <w:top w:val="single" w:color="CCCCCC" w:sz="4"/>
+              <w:left w:val="single" w:color="CCCCCC" w:sz="4"/>
+              <w:bottom w:val="single" w:color="CCCCCC" w:sz="4"/>
+              <w:right w:val="single" w:color="CCCCCC" w:sz="4"/>
+            </w:tcBorders>
+            <w:tcMar>
+              <w:top w:type="dxa" w:w="60"/>
+              <w:left w:type="dxa" w:w="120"/>
+              <w:bottom w:type="dxa" w:w="60"/>
+              <w:right w:type="dxa" w:w="120"/>
+            </w:tcMar>
+          </w:tcPr>
+          <w:p>
+            <w:r>
+              <w:rPr>
+                <w:rFonts w:ascii="Arial" w:cs="Arial" w:eastAsia="Arial" w:hAnsi="Arial"/>
+                <w:sz w:val="18"/>
+                <w:szCs w:val="18"/>
+              </w:rPr>
+              <w:t xml:space="preserve">3</w:t>
+            </w:r>
+          </w:p>
+        </w:tc>
+      </w:tr>
+      <w:tr>
+        <w:tc>
+          <w:tcPr>
+            <w:tcW w:type="dxa" w:w="7000"/>
+            <w:tcBorders>
+              <w:top w:val="single" w:color="CCCCCC" w:sz="4"/>
+              <w:left w:val="single" w:color="CCCCCC" w:sz="4"/>
+              <w:bottom w:val="single" w:color="CCCCCC" w:sz="4"/>
+              <w:right w:val="single" w:color="CCCCCC" w:sz="4"/>
+            </w:tcBorders>
+            <w:tcMar>
+              <w:top w:type="dxa" w:w="60"/>
+              <w:left w:type="dxa" w:w="120"/>
+              <w:bottom w:type="dxa" w:w="60"/>
+              <w:right w:type="dxa" w:w="120"/>
+            </w:tcMar>
+          </w:tcPr>
+          <w:p>
+            <w:r>
+              <w:rPr>
+                <w:rFonts w:ascii="Arial" w:cs="Arial" w:eastAsia="Arial" w:hAnsi="Arial"/>
+                <w:sz w:val="18"/>
+                <w:szCs w:val="18"/>
+              </w:rPr>
+              <w:t xml:space="preserve">4. Data — Big Data, Cleaning, Features, Trends</w:t>
+            </w:r>
+          </w:p>
+        </w:tc>
+        <w:tc>
+          <w:tcPr>
+            <w:tcW w:type="dxa" w:w="2360"/>
+            <w:tcBorders>
+              <w:top w:val="single" w:color="CCCCCC" w:sz="4"/>
+              <w:left w:val="single" w:color="CCCCCC" w:sz="4"/>
+              <w:bottom w:val="single" w:color="CCCCCC" w:sz="4"/>
+              <w:right w:val="single" w:color="CCCCCC" w:sz="4"/>
+            </w:tcBorders>
+            <w:tcMar>
+              <w:top w:type="dxa" w:w="60"/>
+              <w:left w:type="dxa" w:w="120"/>
+              <w:bottom w:type="dxa" w:w="60"/>
+              <w:right w:type="dxa" w:w="120"/>
+            </w:tcMar>
+          </w:tcPr>
+          <w:p>
+            <w:r>
+              <w:rPr>
+                <w:rFonts w:ascii="Arial" w:cs="Arial" w:eastAsia="Arial" w:hAnsi="Arial"/>
+                <w:sz w:val="18"/>
+                <w:szCs w:val="18"/>
+              </w:rPr>
+              <w:t xml:space="preserve">4</w:t>
+            </w:r>
+          </w:p>
+        </w:tc>
+      </w:tr>
+      <w:tr>
+        <w:tc>
+          <w:tcPr>
+            <w:tcW w:type="dxa" w:w="7000"/>
+            <w:tcBorders>
+              <w:top w:val="single" w:color="CCCCCC" w:sz="4"/>
+              <w:left w:val="single" w:color="CCCCCC" w:sz="4"/>
+              <w:bottom w:val="single" w:color="CCCCCC" w:sz="4"/>
+              <w:right w:val="single" w:color="CCCCCC" w:sz="4"/>
+            </w:tcBorders>
+            <w:tcMar>
+              <w:top w:type="dxa" w:w="60"/>
+              <w:left w:type="dxa" w:w="120"/>
+              <w:bottom w:type="dxa" w:w="60"/>
+              <w:right w:type="dxa" w:w="120"/>
+            </w:tcMar>
+          </w:tcPr>
+          <w:p>
+            <w:r>
+              <w:rPr>
+                <w:rFonts w:ascii="Arial" w:cs="Arial" w:eastAsia="Arial" w:hAnsi="Arial"/>
+                <w:sz w:val="18"/>
+                <w:szCs w:val="18"/>
+              </w:rPr>
+              <w:t xml:space="preserve">5-6. Implementation — Algorithms, Baselines, Pseudo-code</w:t>
+            </w:r>
+          </w:p>
+        </w:tc>
+        <w:tc>
+          <w:tcPr>
+            <w:tcW w:type="dxa" w:w="2360"/>
+            <w:tcBorders>
+              <w:top w:val="single" w:color="CCCCCC" w:sz="4"/>
+              <w:left w:val="single" w:color="CCCCCC" w:sz="4"/>
+              <w:bottom w:val="single" w:color="CCCCCC" w:sz="4"/>
+              <w:right w:val="single" w:color="CCCCCC" w:sz="4"/>
+            </w:tcBorders>
+            <w:tcMar>
+              <w:top w:type="dxa" w:w="60"/>
+              <w:left w:type="dxa" w:w="120"/>
+              <w:bottom w:type="dxa" w:w="60"/>
+              <w:right w:type="dxa" w:w="120"/>
+            </w:tcMar>
+          </w:tcPr>
+          <w:p>
+            <w:r>
+              <w:rPr>
+                <w:rFonts w:ascii="Arial" w:cs="Arial" w:eastAsia="Arial" w:hAnsi="Arial"/>
+                <w:sz w:val="18"/>
+                <w:szCs w:val="18"/>
+              </w:rPr>
+              <w:t xml:space="preserve">6</w:t>
+            </w:r>
+          </w:p>
+        </w:tc>
+      </w:tr>
+      <w:tr>
+        <w:tc>
+          <w:tcPr>
+            <w:tcW w:type="dxa" w:w="7000"/>
+            <w:tcBorders>
+              <w:top w:val="single" w:color="CCCCCC" w:sz="4"/>
+              <w:left w:val="single" w:color="CCCCCC" w:sz="4"/>
+              <w:bottom w:val="single" w:color="CCCCCC" w:sz="4"/>
+              <w:right w:val="single" w:color="CCCCCC" w:sz="4"/>
+            </w:tcBorders>
+            <w:tcMar>
+              <w:top w:type="dxa" w:w="60"/>
+              <w:left w:type="dxa" w:w="120"/>
+              <w:bottom w:type="dxa" w:w="60"/>
+              <w:right w:type="dxa" w:w="120"/>
+            </w:tcMar>
+          </w:tcPr>
+          <w:p>
+            <w:r>
+              <w:rPr>
+                <w:rFonts w:ascii="Arial" w:cs="Arial" w:eastAsia="Arial" w:hAnsi="Arial"/>
+                <w:sz w:val="18"/>
+                <w:szCs w:val="18"/>
+              </w:rPr>
+              <w:t xml:space="preserve">7. Testing &amp; Validation</w:t>
+            </w:r>
+          </w:p>
+        </w:tc>
+        <w:tc>
+          <w:tcPr>
+            <w:tcW w:type="dxa" w:w="2360"/>
+            <w:tcBorders>
+              <w:top w:val="single" w:color="CCCCCC" w:sz="4"/>
+              <w:left w:val="single" w:color="CCCCCC" w:sz="4"/>
+              <w:bottom w:val="single" w:color="CCCCCC" w:sz="4"/>
+              <w:right w:val="single" w:color="CCCCCC" w:sz="4"/>
+            </w:tcBorders>
+            <w:tcMar>
+              <w:top w:type="dxa" w:w="60"/>
+              <w:left w:type="dxa" w:w="120"/>
+              <w:bottom w:type="dxa" w:w="60"/>
+              <w:right w:type="dxa" w:w="120"/>
+            </w:tcMar>
+          </w:tcPr>
+          <w:p>
+            <w:r>
+              <w:rPr>
+                <w:rFonts w:ascii="Arial" w:cs="Arial" w:eastAsia="Arial" w:hAnsi="Arial"/>
+                <w:sz w:val="18"/>
+                <w:szCs w:val="18"/>
+              </w:rPr>
+              <w:t xml:space="preserve">8</w:t>
+            </w:r>
+          </w:p>
+        </w:tc>
+      </w:tr>
+      <w:tr>
+        <w:tc>
+          <w:tcPr>
+            <w:tcW w:type="dxa" w:w="7000"/>
+            <w:tcBorders>
+              <w:top w:val="single" w:color="CCCCCC" w:sz="4"/>
+              <w:left w:val="single" w:color="CCCCCC" w:sz="4"/>
+              <w:bottom w:val="single" w:color="CCCCCC" w:sz="4"/>
+              <w:right w:val="single" w:color="CCCCCC" w:sz="4"/>
+            </w:tcBorders>
+            <w:tcMar>
+              <w:top w:type="dxa" w:w="60"/>
+              <w:left w:type="dxa" w:w="120"/>
+              <w:bottom w:type="dxa" w:w="60"/>
+              <w:right w:type="dxa" w:w="120"/>
+            </w:tcMar>
+          </w:tcPr>
+          <w:p>
+            <w:r>
+              <w:rPr>
+                <w:rFonts w:ascii="Arial" w:cs="Arial" w:eastAsia="Arial" w:hAnsi="Arial"/>
+                <w:sz w:val="18"/>
+                <w:szCs w:val="18"/>
+              </w:rPr>
+              <w:t xml:space="preserve">8. Ethical Considerations &amp; Mitigations Implemented</w:t>
+            </w:r>
+          </w:p>
+        </w:tc>
+        <w:tc>
+          <w:tcPr>
+            <w:tcW w:type="dxa" w:w="2360"/>
+            <w:tcBorders>
+              <w:top w:val="single" w:color="CCCCCC" w:sz="4"/>
+              <w:left w:val="single" w:color="CCCCCC" w:sz="4"/>
+              <w:bottom w:val="single" w:color="CCCCCC" w:sz="4"/>
+              <w:right w:val="single" w:color="CCCCCC" w:sz="4"/>
+            </w:tcBorders>
+            <w:tcMar>
+              <w:top w:type="dxa" w:w="60"/>
+              <w:left w:type="dxa" w:w="120"/>
+              <w:bottom w:type="dxa" w:w="60"/>
+              <w:right w:type="dxa" w:w="120"/>
+            </w:tcMar>
+          </w:tcPr>
+          <w:p>
+            <w:r>
+              <w:rPr>
+                <w:rFonts w:ascii="Arial" w:cs="Arial" w:eastAsia="Arial" w:hAnsi="Arial"/>
+                <w:sz w:val="18"/>
+                <w:szCs w:val="18"/>
+              </w:rPr>
+              <w:t xml:space="preserve">9</w:t>
+            </w:r>
+          </w:p>
+        </w:tc>
+      </w:tr>
+      <w:tr>
+        <w:tc>
+          <w:tcPr>
+            <w:tcW w:type="dxa" w:w="7000"/>
+            <w:tcBorders>
+              <w:top w:val="single" w:color="CCCCCC" w:sz="4"/>
+              <w:left w:val="single" w:color="CCCCCC" w:sz="4"/>
+              <w:bottom w:val="single" w:color="CCCCCC" w:sz="4"/>
+              <w:right w:val="single" w:color="CCCCCC" w:sz="4"/>
+            </w:tcBorders>
+            <w:tcMar>
+              <w:top w:type="dxa" w:w="60"/>
+              <w:left w:type="dxa" w:w="120"/>
+              <w:bottom w:type="dxa" w:w="60"/>
+              <w:right w:type="dxa" w:w="120"/>
+            </w:tcMar>
+          </w:tcPr>
+          <w:p>
+            <w:r>
+              <w:rPr>
+                <w:rFonts w:ascii="Arial" w:cs="Arial" w:eastAsia="Arial" w:hAnsi="Arial"/>
+                <w:sz w:val="18"/>
+                <w:szCs w:val="18"/>
+              </w:rPr>
+              <w:t xml:space="preserve">9. Conclusions &amp; Real-World Application</w:t>
+            </w:r>
+          </w:p>
+        </w:tc>
+        <w:tc>
+          <w:tcPr>
+            <w:tcW w:type="dxa" w:w="2360"/>
+            <w:tcBorders>
+              <w:top w:val="single" w:color="CCCCCC" w:sz="4"/>
+              <w:left w:val="single" w:color="CCCCCC" w:sz="4"/>
+              <w:bottom w:val="single" w:color="CCCCCC" w:sz="4"/>
+              <w:right w:val="single" w:color="CCCCCC" w:sz="4"/>
+            </w:tcBorders>
+            <w:tcMar>
+              <w:top w:type="dxa" w:w="60"/>
+              <w:left w:type="dxa" w:w="120"/>
+              <w:bottom w:type="dxa" w:w="60"/>
+              <w:right w:type="dxa" w:w="120"/>
+            </w:tcMar>
+          </w:tcPr>
+          <w:p>
+            <w:r>
+              <w:rPr>
+                <w:rFonts w:ascii="Arial" w:cs="Arial" w:eastAsia="Arial" w:hAnsi="Arial"/>
+                <w:sz w:val="18"/>
+                <w:szCs w:val="18"/>
+              </w:rPr>
+              <w:t xml:space="preserve">9</w:t>
+            </w:r>
+          </w:p>
+        </w:tc>
+      </w:tr>
+      <w:tr>
+        <w:tc>
+          <w:tcPr>
+            <w:tcW w:type="dxa" w:w="7000"/>
+            <w:tcBorders>
+              <w:top w:val="single" w:color="CCCCCC" w:sz="4"/>
+              <w:left w:val="single" w:color="CCCCCC" w:sz="4"/>
+              <w:bottom w:val="single" w:color="CCCCCC" w:sz="4"/>
+              <w:right w:val="single" w:color="CCCCCC" w:sz="4"/>
+            </w:tcBorders>
+            <w:tcMar>
+              <w:top w:type="dxa" w:w="60"/>
+              <w:left w:type="dxa" w:w="120"/>
+              <w:bottom w:type="dxa" w:w="60"/>
+              <w:right w:type="dxa" w:w="120"/>
+            </w:tcMar>
+          </w:tcPr>
+          <w:p>
+            <w:r>
+              <w:rPr>
+                <w:rFonts w:ascii="Arial" w:cs="Arial" w:eastAsia="Arial" w:hAnsi="Arial"/>
+                <w:sz w:val="18"/>
+                <w:szCs w:val="18"/>
+              </w:rPr>
+              <w:t xml:space="preserve">10. Impact Assessment</w:t>
+            </w:r>
+          </w:p>
+        </w:tc>
+        <w:tc>
+          <w:tcPr>
+            <w:tcW w:type="dxa" w:w="2360"/>
+            <w:tcBorders>
+              <w:top w:val="single" w:color="CCCCCC" w:sz="4"/>
+              <w:left w:val="single" w:color="CCCCCC" w:sz="4"/>
+              <w:bottom w:val="single" w:color="CCCCCC" w:sz="4"/>
+              <w:right w:val="single" w:color="CCCCCC" w:sz="4"/>
+            </w:tcBorders>
+            <w:tcMar>
+              <w:top w:type="dxa" w:w="60"/>
+              <w:left w:type="dxa" w:w="120"/>
+              <w:bottom w:type="dxa" w:w="60"/>
+              <w:right w:type="dxa" w:w="120"/>
+            </w:tcMar>
+          </w:tcPr>
+          <w:p>
+            <w:r>
+              <w:rPr>
+                <w:rFonts w:ascii="Arial" w:cs="Arial" w:eastAsia="Arial" w:hAnsi="Arial"/>
+                <w:sz w:val="18"/>
+                <w:szCs w:val="18"/>
+              </w:rPr>
+              <w:t xml:space="preserve">10</w:t>
+            </w:r>
+          </w:p>
+        </w:tc>
+      </w:tr>
+      <w:tr>
+        <w:tc>
+          <w:tcPr>
+            <w:tcW w:type="dxa" w:w="7000"/>
+            <w:tcBorders>
+              <w:top w:val="single" w:color="CCCCCC" w:sz="4"/>
+              <w:left w:val="single" w:color="CCCCCC" w:sz="4"/>
+              <w:bottom w:val="single" w:color="CCCCCC" w:sz="4"/>
+              <w:right w:val="single" w:color="CCCCCC" w:sz="4"/>
+            </w:tcBorders>
+            <w:tcMar>
+              <w:top w:type="dxa" w:w="60"/>
+              <w:left w:type="dxa" w:w="120"/>
+              <w:bottom w:type="dxa" w:w="60"/>
+              <w:right w:type="dxa" w:w="120"/>
+            </w:tcMar>
+          </w:tcPr>
+          <w:p>
+            <w:r>
+              <w:rPr>
+                <w:rFonts w:ascii="Arial" w:cs="Arial" w:eastAsia="Arial" w:hAnsi="Arial"/>
+                <w:sz w:val="18"/>
+                <w:szCs w:val="18"/>
+              </w:rPr>
+              <w:t xml:space="preserve">Appendix — Deliverables, Stack, Links</w:t>
+            </w:r>
+          </w:p>
+        </w:tc>
+        <w:tc>
+          <w:tcPr>
+            <w:tcW w:type="dxa" w:w="2360"/>
+            <w:tcBorders>
+              <w:top w:val="single" w:color="CCCCCC" w:sz="4"/>
+              <w:left w:val="single" w:color="CCCCCC" w:sz="4"/>
+              <w:bottom w:val="single" w:color="CCCCCC" w:sz="4"/>
+              <w:right w:val="single" w:color="CCCCCC" w:sz="4"/>
+            </w:tcBorders>
+            <w:tcMar>
+              <w:top w:type="dxa" w:w="60"/>
+              <w:left w:type="dxa" w:w="120"/>
+              <w:bottom w:type="dxa" w:w="60"/>
+              <w:right w:type="dxa" w:w="120"/>
+            </w:tcMar>
+          </w:tcPr>
+          <w:p>
+            <w:r>
+              <w:rPr>
+                <w:rFonts w:ascii="Arial" w:cs="Arial" w:eastAsia="Arial" w:hAnsi="Arial"/>
+                <w:sz w:val="18"/>
+                <w:szCs w:val="18"/>
+              </w:rPr>
+              <w:t xml:space="preserve">10</w:t>
+            </w:r>
+          </w:p>
+        </w:tc>
+      </w:tr>
+    </w:tbl>
+    <w:p>
+      <w:pPr>
+        <w:spacing w:after="60" w:before="60"/>
+      </w:pPr>
+      <w:r>
+        <w:t xml:space="preserve"/>
+      </w:r>
+    </w:p>
     <w:p>
       <w:r>
         <w:br w:type="page"/>
@@ -2053,7 +2708,189 @@
           <w:sz w:val="24"/>
           <w:szCs w:val="24"/>
         </w:rPr>
-        <w:t xml:space="preserve">4.5 Engineered Features (8 Features)</w:t>
+        <w:t xml:space="preserve">4.5 Trend Detection (Brief Requirement: מגמות)</w:t>
+      </w:r>
+    </w:p>
+    <w:p>
+      <w:pPr>
+        <w:spacing w:after="80" w:before="80"/>
+      </w:pPr>
+      <w:r>
+        <w:rPr>
+          <w:rFonts w:ascii="Arial" w:cs="Arial" w:eastAsia="Arial" w:hAnsi="Arial"/>
+          <w:sz w:val="22"/>
+          <w:szCs w:val="22"/>
+        </w:rPr>
+        <w:t xml:space="preserve">Trend analysis was computed across the full catalog (see engine/trends.py + data/trends.json). Three signals were extracted:</w:t>
+      </w:r>
+    </w:p>
+    <w:p>
+      <w:pPr>
+        <w:spacing w:after="60" w:before="60"/>
+      </w:pPr>
+      <w:r>
+        <w:t xml:space="preserve"/>
+      </w:r>
+    </w:p>
+    <w:p>
+      <w:pPr>
+        <w:spacing w:after="60" w:before="100"/>
+      </w:pPr>
+      <w:r>
+        <w:rPr>
+          <w:rFonts w:ascii="Arial" w:cs="Arial" w:eastAsia="Arial" w:hAnsi="Arial"/>
+          <w:b/>
+          <w:bCs/>
+          <w:sz w:val="22"/>
+          <w:szCs w:val="22"/>
+        </w:rPr>
+        <w:t xml:space="preserve">Quality trend per decade:</w:t>
+      </w:r>
+    </w:p>
+    <w:p>
+      <w:pPr>
+        <w:spacing w:after="80" w:before="80"/>
+      </w:pPr>
+      <w:r>
+        <w:rPr>
+          <w:rFonts w:ascii="Arial" w:cs="Arial" w:eastAsia="Arial" w:hAnsi="Arial"/>
+          <w:sz w:val="22"/>
+          <w:szCs w:val="22"/>
+        </w:rPr>
+        <w:t xml:space="preserve">Average rating peaked in the 1970s (best decade) and bottomed in the 1940s (delta = 0.53 points). Catalog production volume grew exponentially: ~50 shows in the 1950s vs. ~4,500 in the 2010s.</w:t>
+      </w:r>
+    </w:p>
+    <w:p>
+      <w:pPr>
+        <w:spacing w:after="60" w:before="60"/>
+      </w:pPr>
+      <w:r>
+        <w:t xml:space="preserve"/>
+      </w:r>
+    </w:p>
+    <w:p>
+      <w:pPr>
+        <w:spacing w:after="60" w:before="100"/>
+      </w:pPr>
+      <w:r>
+        <w:rPr>
+          <w:rFonts w:ascii="Arial" w:cs="Arial" w:eastAsia="Arial" w:hAnsi="Arial"/>
+          <w:b/>
+          <w:bCs/>
+          <w:sz w:val="22"/>
+          <w:szCs w:val="22"/>
+        </w:rPr>
+        <w:t xml:space="preserve">Rising genres (modern share / classic share, Laplace-smoothed):</w:t>
+      </w:r>
+    </w:p>
+    <w:p>
+      <w:pPr>
+        <w:spacing w:after="80" w:before="80"/>
+      </w:pPr>
+      <w:r>
+        <w:rPr>
+          <w:rFonts w:ascii="Arial" w:cs="Arial" w:eastAsia="Arial" w:hAnsi="Arial"/>
+          <w:sz w:val="22"/>
+          <w:szCs w:val="22"/>
+        </w:rPr>
+        <w:t xml:space="preserve">Top 3 rising — Thriller, Biography, Reality. These genres barely existed in 1970s-1990s TV but dominate 2010s+2020s. The streaming era favors prestige drama (Thriller), biopics, and unscripted formats.</w:t>
+      </w:r>
+    </w:p>
+    <w:p>
+      <w:pPr>
+        <w:spacing w:after="60" w:before="60"/>
+      </w:pPr>
+      <w:r>
+        <w:t xml:space="preserve"/>
+      </w:r>
+    </w:p>
+    <w:p>
+      <w:pPr>
+        <w:spacing w:after="60" w:before="100"/>
+      </w:pPr>
+      <w:r>
+        <w:rPr>
+          <w:rFonts w:ascii="Arial" w:cs="Arial" w:eastAsia="Arial" w:hAnsi="Arial"/>
+          <w:b/>
+          <w:bCs/>
+          <w:sz w:val="22"/>
+          <w:szCs w:val="22"/>
+        </w:rPr>
+        <w:t xml:space="preserve">Declining genres:</w:t>
+      </w:r>
+    </w:p>
+    <w:p>
+      <w:pPr>
+        <w:spacing w:after="80" w:before="80"/>
+      </w:pPr>
+      <w:r>
+        <w:rPr>
+          <w:rFonts w:ascii="Arial" w:cs="Arial" w:eastAsia="Arial" w:hAnsi="Arial"/>
+          <w:sz w:val="22"/>
+          <w:szCs w:val="22"/>
+        </w:rPr>
+        <w:t xml:space="preserve">Top 3 declining — Western, Kids, Family. Westerns peaked in 1960s-70s and have collapsed to &lt;5% of modern catalog share. Family programming has migrated to dedicated children's networks rather than primetime.</w:t>
+      </w:r>
+    </w:p>
+    <w:p>
+      <w:pPr>
+        <w:spacing w:after="60" w:before="60"/>
+      </w:pPr>
+      <w:r>
+        <w:t xml:space="preserve"/>
+      </w:r>
+    </w:p>
+    <w:p>
+      <w:pPr>
+        <w:spacing w:after="60" w:before="100"/>
+      </w:pPr>
+      <w:r>
+        <w:rPr>
+          <w:rFonts w:ascii="Arial" w:cs="Arial" w:eastAsia="Arial" w:hAnsi="Arial"/>
+          <w:b/>
+          <w:bCs/>
+          <w:sz w:val="22"/>
+          <w:szCs w:val="22"/>
+        </w:rPr>
+        <w:t xml:space="preserve">Genre diversity per decade (Shannon entropy):</w:t>
+      </w:r>
+    </w:p>
+    <w:p>
+      <w:pPr>
+        <w:spacing w:after="80" w:before="80"/>
+      </w:pPr>
+      <w:r>
+        <w:rPr>
+          <w:rFonts w:ascii="Arial" w:cs="Arial" w:eastAsia="Arial" w:hAnsi="Arial"/>
+          <w:sz w:val="22"/>
+          <w:szCs w:val="22"/>
+        </w:rPr>
+        <w:t xml:space="preserve">Diversity increased steadily from the 1950s (~2.8 bits) to the 2020s (~4.1 bits) as streaming unlocked niche genres. This is surfaced as a live chart in the agent's Research tab.</w:t>
+      </w:r>
+    </w:p>
+    <w:p>
+      <w:pPr>
+        <w:spacing w:after="60" w:before="60"/>
+      </w:pPr>
+      <w:r>
+        <w:t xml:space="preserve"/>
+      </w:r>
+    </w:p>
+    <w:p>
+      <w:pPr>
+        <w:pStyle w:val="Heading2"/>
+        <w:spacing w:after="100" w:before="200"/>
+      </w:pPr>
+      <w:r>
+        <w:rPr>
+          <w:rFonts w:ascii="Arial" w:cs="Arial" w:eastAsia="Arial" w:hAnsi="Arial"/>
+          <w:b/>
+          <w:bCs/>
+          <w:color w:val="1A3560"/>
+          <w:sz w:val="24"/>
+          <w:szCs w:val="24"/>
+        </w:rPr>
+        <w:t xml:space="preserve">4.6 Engineered Features (8 Features)</w:t>
       </w:r>
     </w:p>
     <w:tbl>
@@ -3030,12 +3867,33 @@
           <w:sz w:val="24"/>
           <w:szCs w:val="24"/>
         </w:rPr>
-        <w:t xml:space="preserve">5.2 Quantitative Comparison (500-row evaluation subset)</w:t>
+        <w:t xml:space="preserve">5.2 Comparison to Existing Baseline Models (Rubric Criterion 5)</w:t>
+      </w:r>
+    </w:p>
+    <w:p>
+      <w:pPr>
+        <w:spacing w:after="80" w:before="80"/>
+      </w:pPr>
+      <w:r>
+        <w:rPr>
+          <w:rFonts w:ascii="Arial" w:cs="Arial" w:eastAsia="Arial" w:hAnsi="Arial"/>
+          <w:sz w:val="22"/>
+          <w:szCs w:val="22"/>
+        </w:rPr>
+        <w:t xml:space="preserve">Per the rubric, two pre-existing model options must be compared. We benchmarked three classical baselines (engine/baselines.py) alongside our four custom methods. All seven were evaluated on the same 500-row subset using a 10-pair hand-rated preference set.</w:t>
+      </w:r>
+    </w:p>
+    <w:p>
+      <w:pPr>
+        <w:spacing w:after="60" w:before="60"/>
+      </w:pPr>
+      <w:r>
+        <w:t xml:space="preserve"/>
       </w:r>
     </w:p>
     <w:tbl>
       <w:tblPr>
-        <w:tblW w:type="dxa" w:w="9260"/>
+        <w:tblW w:type="dxa" w:w="9360"/>
         <w:tblBorders>
           <w:top w:val="single" w:color="auto" w:sz="4"/>
           <w:left w:val="single" w:color="auto" w:sz="4"/>
@@ -3046,16 +3904,15 @@
         </w:tblBorders>
       </w:tblPr>
       <w:tblGrid>
-        <w:gridCol w:w="1800"/>
-        <w:gridCol w:w="1600"/>
-        <w:gridCol w:w="1300"/>
-        <w:gridCol w:w="1300"/>
-        <w:gridCol w:w="3260"/>
+        <w:gridCol w:w="2300"/>
+        <w:gridCol w:w="2200"/>
+        <w:gridCol w:w="1500"/>
+        <w:gridCol w:w="3360"/>
       </w:tblGrid>
       <w:tr>
         <w:tc>
           <w:tcPr>
-            <w:tcW w:type="dxa" w:w="1800"/>
+            <w:tcW w:type="dxa" w:w="2300"/>
             <w:tcBorders>
               <w:top w:val="single" w:color="2E4A7A" w:sz="8"/>
               <w:left w:val="single" w:color="2E4A7A" w:sz="8"/>
@@ -3086,7 +3943,7 @@
         </w:tc>
         <w:tc>
           <w:tcPr>
-            <w:tcW w:type="dxa" w:w="1600"/>
+            <w:tcW w:type="dxa" w:w="2200"/>
             <w:tcBorders>
               <w:top w:val="single" w:color="2E4A7A" w:sz="8"/>
               <w:left w:val="single" w:color="2E4A7A" w:sz="8"/>
@@ -3111,13 +3968,13 @@
                 <w:sz w:val="18"/>
                 <w:szCs w:val="18"/>
               </w:rPr>
-              <w:t xml:space="preserve">Spearman vs Hybrid</w:t>
-            </w:r>
-          </w:p>
-        </w:tc>
-        <w:tc>
-          <w:tcPr>
-            <w:tcW w:type="dxa" w:w="1300"/>
+              <w:t xml:space="preserve">Class</w:t>
+            </w:r>
+          </w:p>
+        </w:tc>
+        <w:tc>
+          <w:tcPr>
+            <w:tcW w:type="dxa" w:w="1500"/>
             <w:tcBorders>
               <w:top w:val="single" w:color="2E4A7A" w:sz="8"/>
               <w:left w:val="single" w:color="2E4A7A" w:sz="8"/>
@@ -3142,13 +3999,13 @@
                 <w:sz w:val="18"/>
                 <w:szCs w:val="18"/>
               </w:rPr>
-              <w:t xml:space="preserve">Agreement@10</w:t>
-            </w:r>
-          </w:p>
-        </w:tc>
-        <w:tc>
-          <w:tcPr>
-            <w:tcW w:type="dxa" w:w="1300"/>
+              <w:t xml:space="preserve">Precision@5</w:t>
+            </w:r>
+          </w:p>
+        </w:tc>
+        <w:tc>
+          <w:tcPr>
+            <w:tcW w:type="dxa" w:w="3360"/>
             <w:tcBorders>
               <w:top w:val="single" w:color="2E4A7A" w:sz="8"/>
               <w:left w:val="single" w:color="2E4A7A" w:sz="8"/>
@@ -3173,38 +4030,7 @@
                 <w:sz w:val="18"/>
                 <w:szCs w:val="18"/>
               </w:rPr>
-              <w:t xml:space="preserve">Precision@5</w:t>
-            </w:r>
-          </w:p>
-        </w:tc>
-        <w:tc>
-          <w:tcPr>
-            <w:tcW w:type="dxa" w:w="3260"/>
-            <w:tcBorders>
-              <w:top w:val="single" w:color="2E4A7A" w:sz="8"/>
-              <w:left w:val="single" w:color="2E4A7A" w:sz="8"/>
-              <w:bottom w:val="single" w:color="2E4A7A" w:sz="8"/>
-              <w:right w:val="single" w:color="2E4A7A" w:sz="8"/>
-            </w:tcBorders>
-            <w:shd w:fill="2E4A7A" w:val="clear"/>
-            <w:tcMar>
-              <w:top w:type="dxa" w:w="80"/>
-              <w:left w:type="dxa" w:w="120"/>
-              <w:bottom w:type="dxa" w:w="80"/>
-              <w:right w:type="dxa" w:w="120"/>
-            </w:tcMar>
-          </w:tcPr>
-          <w:p>
-            <w:r>
-              <w:rPr>
-                <w:rFonts w:ascii="Arial" w:cs="Arial" w:eastAsia="Arial" w:hAnsi="Arial"/>
-                <w:b/>
-                <w:bCs/>
-                <w:color w:val="FFFFFF"/>
-                <w:sz w:val="18"/>
-                <w:szCs w:val="18"/>
-              </w:rPr>
-              <w:t xml:space="preserve">Notes</w:t>
+              <w:t xml:space="preserve">Verdict</w:t>
             </w:r>
           </w:p>
         </w:tc>
@@ -3212,136 +4038,109 @@
       <w:tr>
         <w:tc>
           <w:tcPr>
-            <w:tcW w:type="dxa" w:w="1800"/>
-            <w:tcBorders>
-              <w:top w:val="single" w:color="CCCCCC" w:sz="4"/>
-              <w:left w:val="single" w:color="CCCCCC" w:sz="4"/>
-              <w:bottom w:val="single" w:color="CCCCCC" w:sz="4"/>
-              <w:right w:val="single" w:color="CCCCCC" w:sz="4"/>
-            </w:tcBorders>
-            <w:tcMar>
-              <w:top w:type="dxa" w:w="60"/>
-              <w:left w:type="dxa" w:w="120"/>
-              <w:bottom w:type="dxa" w:w="60"/>
-              <w:right w:type="dxa" w:w="120"/>
-            </w:tcMar>
-          </w:tcPr>
-          <w:p>
-            <w:r>
-              <w:rPr>
-                <w:rFonts w:ascii="Arial" w:cs="Arial" w:eastAsia="Arial" w:hAnsi="Arial"/>
-                <w:sz w:val="18"/>
-                <w:szCs w:val="18"/>
-              </w:rPr>
-              <w:t xml:space="preserve">Jaccard</w:t>
-            </w:r>
-          </w:p>
-        </w:tc>
-        <w:tc>
-          <w:tcPr>
-            <w:tcW w:type="dxa" w:w="1600"/>
-            <w:tcBorders>
-              <w:top w:val="single" w:color="CCCCCC" w:sz="4"/>
-              <w:left w:val="single" w:color="CCCCCC" w:sz="4"/>
-              <w:bottom w:val="single" w:color="CCCCCC" w:sz="4"/>
-              <w:right w:val="single" w:color="CCCCCC" w:sz="4"/>
-            </w:tcBorders>
-            <w:tcMar>
-              <w:top w:type="dxa" w:w="60"/>
-              <w:left w:type="dxa" w:w="120"/>
-              <w:bottom w:type="dxa" w:w="60"/>
-              <w:right w:type="dxa" w:w="120"/>
-            </w:tcMar>
-          </w:tcPr>
-          <w:p>
-            <w:r>
-              <w:rPr>
-                <w:rFonts w:ascii="Arial" w:cs="Arial" w:eastAsia="Arial" w:hAnsi="Arial"/>
-                <w:sz w:val="18"/>
-                <w:szCs w:val="18"/>
-              </w:rPr>
-              <w:t xml:space="preserve">0.764</w:t>
-            </w:r>
-          </w:p>
-        </w:tc>
-        <w:tc>
-          <w:tcPr>
-            <w:tcW w:type="dxa" w:w="1300"/>
-            <w:tcBorders>
-              <w:top w:val="single" w:color="CCCCCC" w:sz="4"/>
-              <w:left w:val="single" w:color="CCCCCC" w:sz="4"/>
-              <w:bottom w:val="single" w:color="CCCCCC" w:sz="4"/>
-              <w:right w:val="single" w:color="CCCCCC" w:sz="4"/>
-            </w:tcBorders>
-            <w:tcMar>
-              <w:top w:type="dxa" w:w="60"/>
-              <w:left w:type="dxa" w:w="120"/>
-              <w:bottom w:type="dxa" w:w="60"/>
-              <w:right w:type="dxa" w:w="120"/>
-            </w:tcMar>
-          </w:tcPr>
-          <w:p>
-            <w:r>
-              <w:rPr>
-                <w:rFonts w:ascii="Arial" w:cs="Arial" w:eastAsia="Arial" w:hAnsi="Arial"/>
-                <w:sz w:val="18"/>
-                <w:szCs w:val="18"/>
-              </w:rPr>
-              <w:t xml:space="preserve">58.9%</w:t>
-            </w:r>
-          </w:p>
-        </w:tc>
-        <w:tc>
-          <w:tcPr>
-            <w:tcW w:type="dxa" w:w="1300"/>
-            <w:tcBorders>
-              <w:top w:val="single" w:color="CCCCCC" w:sz="4"/>
-              <w:left w:val="single" w:color="CCCCCC" w:sz="4"/>
-              <w:bottom w:val="single" w:color="CCCCCC" w:sz="4"/>
-              <w:right w:val="single" w:color="CCCCCC" w:sz="4"/>
-            </w:tcBorders>
-            <w:tcMar>
-              <w:top w:type="dxa" w:w="60"/>
-              <w:left w:type="dxa" w:w="120"/>
-              <w:bottom w:type="dxa" w:w="60"/>
-              <w:right w:type="dxa" w:w="120"/>
-            </w:tcMar>
-          </w:tcPr>
-          <w:p>
-            <w:r>
-              <w:rPr>
-                <w:rFonts w:ascii="Arial" w:cs="Arial" w:eastAsia="Arial" w:hAnsi="Arial"/>
-                <w:sz w:val="18"/>
-                <w:szCs w:val="18"/>
-              </w:rPr>
-              <w:t xml:space="preserve">11.1%</w:t>
-            </w:r>
-          </w:p>
-        </w:tc>
-        <w:tc>
-          <w:tcPr>
-            <w:tcW w:type="dxa" w:w="3260"/>
-            <w:tcBorders>
-              <w:top w:val="single" w:color="CCCCCC" w:sz="4"/>
-              <w:left w:val="single" w:color="CCCCCC" w:sz="4"/>
-              <w:bottom w:val="single" w:color="CCCCCC" w:sz="4"/>
-              <w:right w:val="single" w:color="CCCCCC" w:sz="4"/>
-            </w:tcBorders>
-            <w:tcMar>
-              <w:top w:type="dxa" w:w="60"/>
-              <w:left w:type="dxa" w:w="120"/>
-              <w:bottom w:type="dxa" w:w="60"/>
-              <w:right w:type="dxa" w:w="120"/>
-            </w:tcMar>
-          </w:tcPr>
-          <w:p>
-            <w:r>
-              <w:rPr>
-                <w:rFonts w:ascii="Arial" w:cs="Arial" w:eastAsia="Arial" w:hAnsi="Arial"/>
-                <w:sz w:val="18"/>
-                <w:szCs w:val="18"/>
-              </w:rPr>
-              <w:t xml:space="preserve">Genre/era — sparse, no content</w:t>
+            <w:tcW w:type="dxa" w:w="2300"/>
+            <w:tcBorders>
+              <w:top w:val="single" w:color="CCCCCC" w:sz="4"/>
+              <w:left w:val="single" w:color="CCCCCC" w:sz="4"/>
+              <w:bottom w:val="single" w:color="CCCCCC" w:sz="4"/>
+              <w:right w:val="single" w:color="CCCCCC" w:sz="4"/>
+            </w:tcBorders>
+            <w:tcMar>
+              <w:top w:type="dxa" w:w="60"/>
+              <w:left w:type="dxa" w:w="120"/>
+              <w:bottom w:type="dxa" w:w="60"/>
+              <w:right w:type="dxa" w:w="120"/>
+            </w:tcMar>
+          </w:tcPr>
+          <w:p>
+            <w:r>
+              <w:rPr>
+                <w:rFonts w:ascii="Arial" w:cs="Arial" w:eastAsia="Arial" w:hAnsi="Arial"/>
+                <w:sz w:val="18"/>
+                <w:szCs w:val="18"/>
+              </w:rPr>
+              <w:t xml:space="preserve">Baseline-Random</w:t>
+            </w:r>
+          </w:p>
+        </w:tc>
+        <w:tc>
+          <w:tcPr>
+            <w:tcW w:type="dxa" w:w="2200"/>
+            <w:tcBorders>
+              <w:top w:val="single" w:color="CCCCCC" w:sz="4"/>
+              <w:left w:val="single" w:color="CCCCCC" w:sz="4"/>
+              <w:bottom w:val="single" w:color="CCCCCC" w:sz="4"/>
+              <w:right w:val="single" w:color="CCCCCC" w:sz="4"/>
+            </w:tcBorders>
+            <w:tcMar>
+              <w:top w:type="dxa" w:w="60"/>
+              <w:left w:type="dxa" w:w="120"/>
+              <w:bottom w:type="dxa" w:w="60"/>
+              <w:right w:type="dxa" w:w="120"/>
+            </w:tcMar>
+          </w:tcPr>
+          <w:p>
+            <w:r>
+              <w:rPr>
+                <w:rFonts w:ascii="Arial" w:cs="Arial" w:eastAsia="Arial" w:hAnsi="Arial"/>
+                <w:sz w:val="18"/>
+                <w:szCs w:val="18"/>
+              </w:rPr>
+              <w:t xml:space="preserve">Sanity floor</w:t>
+            </w:r>
+          </w:p>
+        </w:tc>
+        <w:tc>
+          <w:tcPr>
+            <w:tcW w:type="dxa" w:w="1500"/>
+            <w:tcBorders>
+              <w:top w:val="single" w:color="CCCCCC" w:sz="4"/>
+              <w:left w:val="single" w:color="CCCCCC" w:sz="4"/>
+              <w:bottom w:val="single" w:color="CCCCCC" w:sz="4"/>
+              <w:right w:val="single" w:color="CCCCCC" w:sz="4"/>
+            </w:tcBorders>
+            <w:tcMar>
+              <w:top w:type="dxa" w:w="60"/>
+              <w:left w:type="dxa" w:w="120"/>
+              <w:bottom w:type="dxa" w:w="60"/>
+              <w:right w:type="dxa" w:w="120"/>
+            </w:tcMar>
+          </w:tcPr>
+          <w:p>
+            <w:r>
+              <w:rPr>
+                <w:rFonts w:ascii="Arial" w:cs="Arial" w:eastAsia="Arial" w:hAnsi="Arial"/>
+                <w:sz w:val="18"/>
+                <w:szCs w:val="18"/>
+              </w:rPr>
+              <w:t xml:space="preserve">0.0%</w:t>
+            </w:r>
+          </w:p>
+        </w:tc>
+        <w:tc>
+          <w:tcPr>
+            <w:tcW w:type="dxa" w:w="3360"/>
+            <w:tcBorders>
+              <w:top w:val="single" w:color="CCCCCC" w:sz="4"/>
+              <w:left w:val="single" w:color="CCCCCC" w:sz="4"/>
+              <w:bottom w:val="single" w:color="CCCCCC" w:sz="4"/>
+              <w:right w:val="single" w:color="CCCCCC" w:sz="4"/>
+            </w:tcBorders>
+            <w:tcMar>
+              <w:top w:type="dxa" w:w="60"/>
+              <w:left w:type="dxa" w:w="120"/>
+              <w:bottom w:type="dxa" w:w="60"/>
+              <w:right w:type="dxa" w:w="120"/>
+            </w:tcMar>
+          </w:tcPr>
+          <w:p>
+            <w:r>
+              <w:rPr>
+                <w:rFonts w:ascii="Arial" w:cs="Arial" w:eastAsia="Arial" w:hAnsi="Arial"/>
+                <w:sz w:val="18"/>
+                <w:szCs w:val="18"/>
+              </w:rPr>
+              <w:t xml:space="preserve">Below chance; sanity check</w:t>
             </w:r>
           </w:p>
         </w:tc>
@@ -3349,88 +4148,61 @@
       <w:tr>
         <w:tc>
           <w:tcPr>
-            <w:tcW w:type="dxa" w:w="1800"/>
-            <w:tcBorders>
-              <w:top w:val="single" w:color="CCCCCC" w:sz="4"/>
-              <w:left w:val="single" w:color="CCCCCC" w:sz="4"/>
-              <w:bottom w:val="single" w:color="CCCCCC" w:sz="4"/>
-              <w:right w:val="single" w:color="CCCCCC" w:sz="4"/>
-            </w:tcBorders>
-            <w:tcMar>
-              <w:top w:type="dxa" w:w="60"/>
-              <w:left w:type="dxa" w:w="120"/>
-              <w:bottom w:type="dxa" w:w="60"/>
-              <w:right w:type="dxa" w:w="120"/>
-            </w:tcMar>
-          </w:tcPr>
-          <w:p>
-            <w:r>
-              <w:rPr>
-                <w:rFonts w:ascii="Arial" w:cs="Arial" w:eastAsia="Arial" w:hAnsi="Arial"/>
-                <w:sz w:val="18"/>
-                <w:szCs w:val="18"/>
-              </w:rPr>
-              <w:t xml:space="preserve">Cosine-numeric</w:t>
-            </w:r>
-          </w:p>
-        </w:tc>
-        <w:tc>
-          <w:tcPr>
-            <w:tcW w:type="dxa" w:w="1600"/>
-            <w:tcBorders>
-              <w:top w:val="single" w:color="CCCCCC" w:sz="4"/>
-              <w:left w:val="single" w:color="CCCCCC" w:sz="4"/>
-              <w:bottom w:val="single" w:color="CCCCCC" w:sz="4"/>
-              <w:right w:val="single" w:color="CCCCCC" w:sz="4"/>
-            </w:tcBorders>
-            <w:tcMar>
-              <w:top w:type="dxa" w:w="60"/>
-              <w:left w:type="dxa" w:w="120"/>
-              <w:bottom w:type="dxa" w:w="60"/>
-              <w:right w:type="dxa" w:w="120"/>
-            </w:tcMar>
-          </w:tcPr>
-          <w:p>
-            <w:r>
-              <w:rPr>
-                <w:rFonts w:ascii="Arial" w:cs="Arial" w:eastAsia="Arial" w:hAnsi="Arial"/>
-                <w:sz w:val="18"/>
-                <w:szCs w:val="18"/>
-              </w:rPr>
-              <w:t xml:space="preserve">0.619</w:t>
-            </w:r>
-          </w:p>
-        </w:tc>
-        <w:tc>
-          <w:tcPr>
-            <w:tcW w:type="dxa" w:w="1300"/>
-            <w:tcBorders>
-              <w:top w:val="single" w:color="CCCCCC" w:sz="4"/>
-              <w:left w:val="single" w:color="CCCCCC" w:sz="4"/>
-              <w:bottom w:val="single" w:color="CCCCCC" w:sz="4"/>
-              <w:right w:val="single" w:color="CCCCCC" w:sz="4"/>
-            </w:tcBorders>
-            <w:tcMar>
-              <w:top w:type="dxa" w:w="60"/>
-              <w:left w:type="dxa" w:w="120"/>
-              <w:bottom w:type="dxa" w:w="60"/>
-              <w:right w:type="dxa" w:w="120"/>
-            </w:tcMar>
-          </w:tcPr>
-          <w:p>
-            <w:r>
-              <w:rPr>
-                <w:rFonts w:ascii="Arial" w:cs="Arial" w:eastAsia="Arial" w:hAnsi="Arial"/>
-                <w:sz w:val="18"/>
-                <w:szCs w:val="18"/>
-              </w:rPr>
-              <w:t xml:space="preserve">N/A</w:t>
-            </w:r>
-          </w:p>
-        </w:tc>
-        <w:tc>
-          <w:tcPr>
-            <w:tcW w:type="dxa" w:w="1300"/>
+            <w:tcW w:type="dxa" w:w="2300"/>
+            <w:tcBorders>
+              <w:top w:val="single" w:color="CCCCCC" w:sz="4"/>
+              <w:left w:val="single" w:color="CCCCCC" w:sz="4"/>
+              <w:bottom w:val="single" w:color="CCCCCC" w:sz="4"/>
+              <w:right w:val="single" w:color="CCCCCC" w:sz="4"/>
+            </w:tcBorders>
+            <w:tcMar>
+              <w:top w:type="dxa" w:w="60"/>
+              <w:left w:type="dxa" w:w="120"/>
+              <w:bottom w:type="dxa" w:w="60"/>
+              <w:right w:type="dxa" w:w="120"/>
+            </w:tcMar>
+          </w:tcPr>
+          <w:p>
+            <w:r>
+              <w:rPr>
+                <w:rFonts w:ascii="Arial" w:cs="Arial" w:eastAsia="Arial" w:hAnsi="Arial"/>
+                <w:sz w:val="18"/>
+                <w:szCs w:val="18"/>
+              </w:rPr>
+              <w:t xml:space="preserve">Baseline-Popularity</w:t>
+            </w:r>
+          </w:p>
+        </w:tc>
+        <w:tc>
+          <w:tcPr>
+            <w:tcW w:type="dxa" w:w="2200"/>
+            <w:tcBorders>
+              <w:top w:val="single" w:color="CCCCCC" w:sz="4"/>
+              <w:left w:val="single" w:color="CCCCCC" w:sz="4"/>
+              <w:bottom w:val="single" w:color="CCCCCC" w:sz="4"/>
+              <w:right w:val="single" w:color="CCCCCC" w:sz="4"/>
+            </w:tcBorders>
+            <w:tcMar>
+              <w:top w:type="dxa" w:w="60"/>
+              <w:left w:type="dxa" w:w="120"/>
+              <w:bottom w:type="dxa" w:w="60"/>
+              <w:right w:type="dxa" w:w="120"/>
+            </w:tcMar>
+          </w:tcPr>
+          <w:p>
+            <w:r>
+              <w:rPr>
+                <w:rFonts w:ascii="Arial" w:cs="Arial" w:eastAsia="Arial" w:hAnsi="Arial"/>
+                <w:sz w:val="18"/>
+                <w:szCs w:val="18"/>
+              </w:rPr>
+              <w:t xml:space="preserve">Existing (Top-Rated style)</w:t>
+            </w:r>
+          </w:p>
+        </w:tc>
+        <w:tc>
+          <w:tcPr>
+            <w:tcW w:type="dxa" w:w="1500"/>
             <w:tcBorders>
               <w:top w:val="single" w:color="CCCCCC" w:sz="4"/>
               <w:left w:val="single" w:color="CCCCCC" w:sz="4"/>
@@ -3457,28 +4229,28 @@
         </w:tc>
         <w:tc>
           <w:tcPr>
-            <w:tcW w:type="dxa" w:w="3260"/>
-            <w:tcBorders>
-              <w:top w:val="single" w:color="CCCCCC" w:sz="4"/>
-              <w:left w:val="single" w:color="CCCCCC" w:sz="4"/>
-              <w:bottom w:val="single" w:color="CCCCCC" w:sz="4"/>
-              <w:right w:val="single" w:color="CCCCCC" w:sz="4"/>
-            </w:tcBorders>
-            <w:tcMar>
-              <w:top w:type="dxa" w:w="60"/>
-              <w:left w:type="dxa" w:w="120"/>
-              <w:bottom w:type="dxa" w:w="60"/>
-              <w:right w:type="dxa" w:w="120"/>
-            </w:tcMar>
-          </w:tcPr>
-          <w:p>
-            <w:r>
-              <w:rPr>
-                <w:rFonts w:ascii="Arial" w:cs="Arial" w:eastAsia="Arial" w:hAnsi="Arial"/>
-                <w:sz w:val="18"/>
-                <w:szCs w:val="18"/>
-              </w:rPr>
-              <w:t xml:space="preserve">Profile — era bias, no content</w:t>
+            <w:tcW w:type="dxa" w:w="3360"/>
+            <w:tcBorders>
+              <w:top w:val="single" w:color="CCCCCC" w:sz="4"/>
+              <w:left w:val="single" w:color="CCCCCC" w:sz="4"/>
+              <w:bottom w:val="single" w:color="CCCCCC" w:sz="4"/>
+              <w:right w:val="single" w:color="CCCCCC" w:sz="4"/>
+            </w:tcBorders>
+            <w:tcMar>
+              <w:top w:type="dxa" w:w="60"/>
+              <w:left w:type="dxa" w:w="120"/>
+              <w:bottom w:type="dxa" w:w="60"/>
+              <w:right w:type="dxa" w:w="120"/>
+            </w:tcMar>
+          </w:tcPr>
+          <w:p>
+            <w:r>
+              <w:rPr>
+                <w:rFonts w:ascii="Arial" w:cs="Arial" w:eastAsia="Arial" w:hAnsi="Arial"/>
+                <w:sz w:val="18"/>
+                <w:szCs w:val="18"/>
+              </w:rPr>
+              <w:t xml:space="preserve">Same recs for everyone; not personalized</w:t>
             </w:r>
           </w:p>
         </w:tc>
@@ -3486,136 +4258,109 @@
       <w:tr>
         <w:tc>
           <w:tcPr>
-            <w:tcW w:type="dxa" w:w="1800"/>
-            <w:tcBorders>
-              <w:top w:val="single" w:color="CCCCCC" w:sz="4"/>
-              <w:left w:val="single" w:color="CCCCCC" w:sz="4"/>
-              <w:bottom w:val="single" w:color="CCCCCC" w:sz="4"/>
-              <w:right w:val="single" w:color="CCCCCC" w:sz="4"/>
-            </w:tcBorders>
-            <w:tcMar>
-              <w:top w:type="dxa" w:w="60"/>
-              <w:left w:type="dxa" w:w="120"/>
-              <w:bottom w:type="dxa" w:w="60"/>
-              <w:right w:type="dxa" w:w="120"/>
-            </w:tcMar>
-          </w:tcPr>
-          <w:p>
-            <w:r>
-              <w:rPr>
-                <w:rFonts w:ascii="Arial" w:cs="Arial" w:eastAsia="Arial" w:hAnsi="Arial"/>
-                <w:sz w:val="18"/>
-                <w:szCs w:val="18"/>
-              </w:rPr>
-              <w:t xml:space="preserve">Cosine-text</w:t>
-            </w:r>
-          </w:p>
-        </w:tc>
-        <w:tc>
-          <w:tcPr>
-            <w:tcW w:type="dxa" w:w="1600"/>
-            <w:tcBorders>
-              <w:top w:val="single" w:color="CCCCCC" w:sz="4"/>
-              <w:left w:val="single" w:color="CCCCCC" w:sz="4"/>
-              <w:bottom w:val="single" w:color="CCCCCC" w:sz="4"/>
-              <w:right w:val="single" w:color="CCCCCC" w:sz="4"/>
-            </w:tcBorders>
-            <w:tcMar>
-              <w:top w:type="dxa" w:w="60"/>
-              <w:left w:type="dxa" w:w="120"/>
-              <w:bottom w:type="dxa" w:w="60"/>
-              <w:right w:type="dxa" w:w="120"/>
-            </w:tcMar>
-          </w:tcPr>
-          <w:p>
-            <w:r>
-              <w:rPr>
-                <w:rFonts w:ascii="Arial" w:cs="Arial" w:eastAsia="Arial" w:hAnsi="Arial"/>
-                <w:sz w:val="18"/>
-                <w:szCs w:val="18"/>
-              </w:rPr>
-              <w:t xml:space="preserve">0.655</w:t>
-            </w:r>
-          </w:p>
-        </w:tc>
-        <w:tc>
-          <w:tcPr>
-            <w:tcW w:type="dxa" w:w="1300"/>
-            <w:tcBorders>
-              <w:top w:val="single" w:color="CCCCCC" w:sz="4"/>
-              <w:left w:val="single" w:color="CCCCCC" w:sz="4"/>
-              <w:bottom w:val="single" w:color="CCCCCC" w:sz="4"/>
-              <w:right w:val="single" w:color="CCCCCC" w:sz="4"/>
-            </w:tcBorders>
-            <w:tcMar>
-              <w:top w:type="dxa" w:w="60"/>
-              <w:left w:type="dxa" w:w="120"/>
-              <w:bottom w:type="dxa" w:w="60"/>
-              <w:right w:type="dxa" w:w="120"/>
-            </w:tcMar>
-          </w:tcPr>
-          <w:p>
-            <w:r>
-              <w:rPr>
-                <w:rFonts w:ascii="Arial" w:cs="Arial" w:eastAsia="Arial" w:hAnsi="Arial"/>
-                <w:sz w:val="18"/>
-                <w:szCs w:val="18"/>
-              </w:rPr>
-              <w:t xml:space="preserve">30.0%</w:t>
-            </w:r>
-          </w:p>
-        </w:tc>
-        <w:tc>
-          <w:tcPr>
-            <w:tcW w:type="dxa" w:w="1300"/>
-            <w:tcBorders>
-              <w:top w:val="single" w:color="CCCCCC" w:sz="4"/>
-              <w:left w:val="single" w:color="CCCCCC" w:sz="4"/>
-              <w:bottom w:val="single" w:color="CCCCCC" w:sz="4"/>
-              <w:right w:val="single" w:color="CCCCCC" w:sz="4"/>
-            </w:tcBorders>
-            <w:tcMar>
-              <w:top w:type="dxa" w:w="60"/>
-              <w:left w:type="dxa" w:w="120"/>
-              <w:bottom w:type="dxa" w:w="60"/>
-              <w:right w:type="dxa" w:w="120"/>
-            </w:tcMar>
-          </w:tcPr>
-          <w:p>
-            <w:r>
-              <w:rPr>
-                <w:rFonts w:ascii="Arial" w:cs="Arial" w:eastAsia="Arial" w:hAnsi="Arial"/>
-                <w:sz w:val="18"/>
-                <w:szCs w:val="18"/>
-              </w:rPr>
-              <w:t xml:space="preserve">22.2%</w:t>
-            </w:r>
-          </w:p>
-        </w:tc>
-        <w:tc>
-          <w:tcPr>
-            <w:tcW w:type="dxa" w:w="3260"/>
-            <w:tcBorders>
-              <w:top w:val="single" w:color="CCCCCC" w:sz="4"/>
-              <w:left w:val="single" w:color="CCCCCC" w:sz="4"/>
-              <w:bottom w:val="single" w:color="CCCCCC" w:sz="4"/>
-              <w:right w:val="single" w:color="CCCCCC" w:sz="4"/>
-            </w:tcBorders>
-            <w:tcMar>
-              <w:top w:type="dxa" w:w="60"/>
-              <w:left w:type="dxa" w:w="120"/>
-              <w:bottom w:type="dxa" w:w="60"/>
-              <w:right w:type="dxa" w:w="120"/>
-            </w:tcMar>
-          </w:tcPr>
-          <w:p>
-            <w:r>
-              <w:rPr>
-                <w:rFonts w:ascii="Arial" w:cs="Arial" w:eastAsia="Arial" w:hAnsi="Arial"/>
-                <w:sz w:val="18"/>
-                <w:szCs w:val="18"/>
-              </w:rPr>
-              <w:t xml:space="preserve">Semantic — multilingual, plot-based</w:t>
+            <w:tcW w:type="dxa" w:w="2300"/>
+            <w:tcBorders>
+              <w:top w:val="single" w:color="CCCCCC" w:sz="4"/>
+              <w:left w:val="single" w:color="CCCCCC" w:sz="4"/>
+              <w:bottom w:val="single" w:color="CCCCCC" w:sz="4"/>
+              <w:right w:val="single" w:color="CCCCCC" w:sz="4"/>
+            </w:tcBorders>
+            <w:tcMar>
+              <w:top w:type="dxa" w:w="60"/>
+              <w:left w:type="dxa" w:w="120"/>
+              <w:bottom w:type="dxa" w:w="60"/>
+              <w:right w:type="dxa" w:w="120"/>
+            </w:tcMar>
+          </w:tcPr>
+          <w:p>
+            <w:r>
+              <w:rPr>
+                <w:rFonts w:ascii="Arial" w:cs="Arial" w:eastAsia="Arial" w:hAnsi="Arial"/>
+                <w:sz w:val="18"/>
+                <w:szCs w:val="18"/>
+              </w:rPr>
+              <w:t xml:space="preserve">Baseline-TF-IDF + Cosine</w:t>
+            </w:r>
+          </w:p>
+        </w:tc>
+        <w:tc>
+          <w:tcPr>
+            <w:tcW w:type="dxa" w:w="2200"/>
+            <w:tcBorders>
+              <w:top w:val="single" w:color="CCCCCC" w:sz="4"/>
+              <w:left w:val="single" w:color="CCCCCC" w:sz="4"/>
+              <w:bottom w:val="single" w:color="CCCCCC" w:sz="4"/>
+              <w:right w:val="single" w:color="CCCCCC" w:sz="4"/>
+            </w:tcBorders>
+            <w:tcMar>
+              <w:top w:type="dxa" w:w="60"/>
+              <w:left w:type="dxa" w:w="120"/>
+              <w:bottom w:type="dxa" w:w="60"/>
+              <w:right w:type="dxa" w:w="120"/>
+            </w:tcMar>
+          </w:tcPr>
+          <w:p>
+            <w:r>
+              <w:rPr>
+                <w:rFonts w:ascii="Arial" w:cs="Arial" w:eastAsia="Arial" w:hAnsi="Arial"/>
+                <w:sz w:val="18"/>
+                <w:szCs w:val="18"/>
+              </w:rPr>
+              <w:t xml:space="preserve">Existing (classical NLP)</w:t>
+            </w:r>
+          </w:p>
+        </w:tc>
+        <w:tc>
+          <w:tcPr>
+            <w:tcW w:type="dxa" w:w="1500"/>
+            <w:tcBorders>
+              <w:top w:val="single" w:color="CCCCCC" w:sz="4"/>
+              <w:left w:val="single" w:color="CCCCCC" w:sz="4"/>
+              <w:bottom w:val="single" w:color="CCCCCC" w:sz="4"/>
+              <w:right w:val="single" w:color="CCCCCC" w:sz="4"/>
+            </w:tcBorders>
+            <w:tcMar>
+              <w:top w:type="dxa" w:w="60"/>
+              <w:left w:type="dxa" w:w="120"/>
+              <w:bottom w:type="dxa" w:w="60"/>
+              <w:right w:type="dxa" w:w="120"/>
+            </w:tcMar>
+          </w:tcPr>
+          <w:p>
+            <w:r>
+              <w:rPr>
+                <w:rFonts w:ascii="Arial" w:cs="Arial" w:eastAsia="Arial" w:hAnsi="Arial"/>
+                <w:sz w:val="18"/>
+                <w:szCs w:val="18"/>
+              </w:rPr>
+              <w:t xml:space="preserve">11.1%</w:t>
+            </w:r>
+          </w:p>
+        </w:tc>
+        <w:tc>
+          <w:tcPr>
+            <w:tcW w:type="dxa" w:w="3360"/>
+            <w:tcBorders>
+              <w:top w:val="single" w:color="CCCCCC" w:sz="4"/>
+              <w:left w:val="single" w:color="CCCCCC" w:sz="4"/>
+              <w:bottom w:val="single" w:color="CCCCCC" w:sz="4"/>
+              <w:right w:val="single" w:color="CCCCCC" w:sz="4"/>
+            </w:tcBorders>
+            <w:tcMar>
+              <w:top w:type="dxa" w:w="60"/>
+              <w:left w:type="dxa" w:w="120"/>
+              <w:bottom w:type="dxa" w:w="60"/>
+              <w:right w:type="dxa" w:w="120"/>
+            </w:tcMar>
+          </w:tcPr>
+          <w:p>
+            <w:r>
+              <w:rPr>
+                <w:rFonts w:ascii="Arial" w:cs="Arial" w:eastAsia="Arial" w:hAnsi="Arial"/>
+                <w:sz w:val="18"/>
+                <w:szCs w:val="18"/>
+              </w:rPr>
+              <w:t xml:space="preserve">Industry-standard text recommender</w:t>
             </w:r>
           </w:p>
         </w:tc>
@@ -3623,7 +4368,337 @@
       <w:tr>
         <w:tc>
           <w:tcPr>
-            <w:tcW w:type="dxa" w:w="1800"/>
+            <w:tcW w:type="dxa" w:w="2300"/>
+            <w:tcBorders>
+              <w:top w:val="single" w:color="CCCCCC" w:sz="4"/>
+              <w:left w:val="single" w:color="CCCCCC" w:sz="4"/>
+              <w:bottom w:val="single" w:color="CCCCCC" w:sz="4"/>
+              <w:right w:val="single" w:color="CCCCCC" w:sz="4"/>
+            </w:tcBorders>
+            <w:tcMar>
+              <w:top w:type="dxa" w:w="60"/>
+              <w:left w:type="dxa" w:w="120"/>
+              <w:bottom w:type="dxa" w:w="60"/>
+              <w:right w:type="dxa" w:w="120"/>
+            </w:tcMar>
+          </w:tcPr>
+          <w:p>
+            <w:r>
+              <w:rPr>
+                <w:rFonts w:ascii="Arial" w:cs="Arial" w:eastAsia="Arial" w:hAnsi="Arial"/>
+                <w:sz w:val="18"/>
+                <w:szCs w:val="18"/>
+              </w:rPr>
+              <w:t xml:space="preserve">Jaccard (ours)</w:t>
+            </w:r>
+          </w:p>
+        </w:tc>
+        <w:tc>
+          <w:tcPr>
+            <w:tcW w:type="dxa" w:w="2200"/>
+            <w:tcBorders>
+              <w:top w:val="single" w:color="CCCCCC" w:sz="4"/>
+              <w:left w:val="single" w:color="CCCCCC" w:sz="4"/>
+              <w:bottom w:val="single" w:color="CCCCCC" w:sz="4"/>
+              <w:right w:val="single" w:color="CCCCCC" w:sz="4"/>
+            </w:tcBorders>
+            <w:tcMar>
+              <w:top w:type="dxa" w:w="60"/>
+              <w:left w:type="dxa" w:w="120"/>
+              <w:bottom w:type="dxa" w:w="60"/>
+              <w:right w:type="dxa" w:w="120"/>
+            </w:tcMar>
+          </w:tcPr>
+          <w:p>
+            <w:r>
+              <w:rPr>
+                <w:rFonts w:ascii="Arial" w:cs="Arial" w:eastAsia="Arial" w:hAnsi="Arial"/>
+                <w:sz w:val="18"/>
+                <w:szCs w:val="18"/>
+              </w:rPr>
+              <w:t xml:space="preserve">Custom — discrete sets</w:t>
+            </w:r>
+          </w:p>
+        </w:tc>
+        <w:tc>
+          <w:tcPr>
+            <w:tcW w:type="dxa" w:w="1500"/>
+            <w:tcBorders>
+              <w:top w:val="single" w:color="CCCCCC" w:sz="4"/>
+              <w:left w:val="single" w:color="CCCCCC" w:sz="4"/>
+              <w:bottom w:val="single" w:color="CCCCCC" w:sz="4"/>
+              <w:right w:val="single" w:color="CCCCCC" w:sz="4"/>
+            </w:tcBorders>
+            <w:tcMar>
+              <w:top w:type="dxa" w:w="60"/>
+              <w:left w:type="dxa" w:w="120"/>
+              <w:bottom w:type="dxa" w:w="60"/>
+              <w:right w:type="dxa" w:w="120"/>
+            </w:tcMar>
+          </w:tcPr>
+          <w:p>
+            <w:r>
+              <w:rPr>
+                <w:rFonts w:ascii="Arial" w:cs="Arial" w:eastAsia="Arial" w:hAnsi="Arial"/>
+                <w:sz w:val="18"/>
+                <w:szCs w:val="18"/>
+              </w:rPr>
+              <w:t xml:space="preserve">11.1%</w:t>
+            </w:r>
+          </w:p>
+        </w:tc>
+        <w:tc>
+          <w:tcPr>
+            <w:tcW w:type="dxa" w:w="3360"/>
+            <w:tcBorders>
+              <w:top w:val="single" w:color="CCCCCC" w:sz="4"/>
+              <w:left w:val="single" w:color="CCCCCC" w:sz="4"/>
+              <w:bottom w:val="single" w:color="CCCCCC" w:sz="4"/>
+              <w:right w:val="single" w:color="CCCCCC" w:sz="4"/>
+            </w:tcBorders>
+            <w:tcMar>
+              <w:top w:type="dxa" w:w="60"/>
+              <w:left w:type="dxa" w:w="120"/>
+              <w:bottom w:type="dxa" w:w="60"/>
+              <w:right w:type="dxa" w:w="120"/>
+            </w:tcMar>
+          </w:tcPr>
+          <w:p>
+            <w:r>
+              <w:rPr>
+                <w:rFonts w:ascii="Arial" w:cs="Arial" w:eastAsia="Arial" w:hAnsi="Arial"/>
+                <w:sz w:val="18"/>
+                <w:szCs w:val="18"/>
+              </w:rPr>
+              <w:t xml:space="preserve">Ties TF-IDF; orthogonal signal</w:t>
+            </w:r>
+          </w:p>
+        </w:tc>
+      </w:tr>
+      <w:tr>
+        <w:tc>
+          <w:tcPr>
+            <w:tcW w:type="dxa" w:w="2300"/>
+            <w:tcBorders>
+              <w:top w:val="single" w:color="CCCCCC" w:sz="4"/>
+              <w:left w:val="single" w:color="CCCCCC" w:sz="4"/>
+              <w:bottom w:val="single" w:color="CCCCCC" w:sz="4"/>
+              <w:right w:val="single" w:color="CCCCCC" w:sz="4"/>
+            </w:tcBorders>
+            <w:tcMar>
+              <w:top w:type="dxa" w:w="60"/>
+              <w:left w:type="dxa" w:w="120"/>
+              <w:bottom w:type="dxa" w:w="60"/>
+              <w:right w:type="dxa" w:w="120"/>
+            </w:tcMar>
+          </w:tcPr>
+          <w:p>
+            <w:r>
+              <w:rPr>
+                <w:rFonts w:ascii="Arial" w:cs="Arial" w:eastAsia="Arial" w:hAnsi="Arial"/>
+                <w:sz w:val="18"/>
+                <w:szCs w:val="18"/>
+              </w:rPr>
+              <w:t xml:space="preserve">Cosine-numeric (ours)</w:t>
+            </w:r>
+          </w:p>
+        </w:tc>
+        <w:tc>
+          <w:tcPr>
+            <w:tcW w:type="dxa" w:w="2200"/>
+            <w:tcBorders>
+              <w:top w:val="single" w:color="CCCCCC" w:sz="4"/>
+              <w:left w:val="single" w:color="CCCCCC" w:sz="4"/>
+              <w:bottom w:val="single" w:color="CCCCCC" w:sz="4"/>
+              <w:right w:val="single" w:color="CCCCCC" w:sz="4"/>
+            </w:tcBorders>
+            <w:tcMar>
+              <w:top w:type="dxa" w:w="60"/>
+              <w:left w:type="dxa" w:w="120"/>
+              <w:bottom w:type="dxa" w:w="60"/>
+              <w:right w:type="dxa" w:w="120"/>
+            </w:tcMar>
+          </w:tcPr>
+          <w:p>
+            <w:r>
+              <w:rPr>
+                <w:rFonts w:ascii="Arial" w:cs="Arial" w:eastAsia="Arial" w:hAnsi="Arial"/>
+                <w:sz w:val="18"/>
+                <w:szCs w:val="18"/>
+              </w:rPr>
+              <w:t xml:space="preserve">Custom — z-scored profile</w:t>
+            </w:r>
+          </w:p>
+        </w:tc>
+        <w:tc>
+          <w:tcPr>
+            <w:tcW w:type="dxa" w:w="1500"/>
+            <w:tcBorders>
+              <w:top w:val="single" w:color="CCCCCC" w:sz="4"/>
+              <w:left w:val="single" w:color="CCCCCC" w:sz="4"/>
+              <w:bottom w:val="single" w:color="CCCCCC" w:sz="4"/>
+              <w:right w:val="single" w:color="CCCCCC" w:sz="4"/>
+            </w:tcBorders>
+            <w:tcMar>
+              <w:top w:type="dxa" w:w="60"/>
+              <w:left w:type="dxa" w:w="120"/>
+              <w:bottom w:type="dxa" w:w="60"/>
+              <w:right w:type="dxa" w:w="120"/>
+            </w:tcMar>
+          </w:tcPr>
+          <w:p>
+            <w:r>
+              <w:rPr>
+                <w:rFonts w:ascii="Arial" w:cs="Arial" w:eastAsia="Arial" w:hAnsi="Arial"/>
+                <w:sz w:val="18"/>
+                <w:szCs w:val="18"/>
+              </w:rPr>
+              <w:t xml:space="preserve">0.0%</w:t>
+            </w:r>
+          </w:p>
+        </w:tc>
+        <w:tc>
+          <w:tcPr>
+            <w:tcW w:type="dxa" w:w="3360"/>
+            <w:tcBorders>
+              <w:top w:val="single" w:color="CCCCCC" w:sz="4"/>
+              <w:left w:val="single" w:color="CCCCCC" w:sz="4"/>
+              <w:bottom w:val="single" w:color="CCCCCC" w:sz="4"/>
+              <w:right w:val="single" w:color="CCCCCC" w:sz="4"/>
+            </w:tcBorders>
+            <w:tcMar>
+              <w:top w:type="dxa" w:w="60"/>
+              <w:left w:type="dxa" w:w="120"/>
+              <w:bottom w:type="dxa" w:w="60"/>
+              <w:right w:type="dxa" w:w="120"/>
+            </w:tcMar>
+          </w:tcPr>
+          <w:p>
+            <w:r>
+              <w:rPr>
+                <w:rFonts w:ascii="Arial" w:cs="Arial" w:eastAsia="Arial" w:hAnsi="Arial"/>
+                <w:sz w:val="18"/>
+                <w:szCs w:val="18"/>
+              </w:rPr>
+              <w:t xml:space="preserve">Era bias; not enough alone</w:t>
+            </w:r>
+          </w:p>
+        </w:tc>
+      </w:tr>
+      <w:tr>
+        <w:tc>
+          <w:tcPr>
+            <w:tcW w:type="dxa" w:w="2300"/>
+            <w:tcBorders>
+              <w:top w:val="single" w:color="CCCCCC" w:sz="4"/>
+              <w:left w:val="single" w:color="CCCCCC" w:sz="4"/>
+              <w:bottom w:val="single" w:color="CCCCCC" w:sz="4"/>
+              <w:right w:val="single" w:color="CCCCCC" w:sz="4"/>
+            </w:tcBorders>
+            <w:tcMar>
+              <w:top w:type="dxa" w:w="60"/>
+              <w:left w:type="dxa" w:w="120"/>
+              <w:bottom w:type="dxa" w:w="60"/>
+              <w:right w:type="dxa" w:w="120"/>
+            </w:tcMar>
+          </w:tcPr>
+          <w:p>
+            <w:r>
+              <w:rPr>
+                <w:rFonts w:ascii="Arial" w:cs="Arial" w:eastAsia="Arial" w:hAnsi="Arial"/>
+                <w:sz w:val="18"/>
+                <w:szCs w:val="18"/>
+              </w:rPr>
+              <w:t xml:space="preserve">Cosine-text (ours)</w:t>
+            </w:r>
+          </w:p>
+        </w:tc>
+        <w:tc>
+          <w:tcPr>
+            <w:tcW w:type="dxa" w:w="2200"/>
+            <w:tcBorders>
+              <w:top w:val="single" w:color="CCCCCC" w:sz="4"/>
+              <w:left w:val="single" w:color="CCCCCC" w:sz="4"/>
+              <w:bottom w:val="single" w:color="CCCCCC" w:sz="4"/>
+              <w:right w:val="single" w:color="CCCCCC" w:sz="4"/>
+            </w:tcBorders>
+            <w:tcMar>
+              <w:top w:type="dxa" w:w="60"/>
+              <w:left w:type="dxa" w:w="120"/>
+              <w:bottom w:type="dxa" w:w="60"/>
+              <w:right w:type="dxa" w:w="120"/>
+            </w:tcMar>
+          </w:tcPr>
+          <w:p>
+            <w:r>
+              <w:rPr>
+                <w:rFonts w:ascii="Arial" w:cs="Arial" w:eastAsia="Arial" w:hAnsi="Arial"/>
+                <w:sz w:val="18"/>
+                <w:szCs w:val="18"/>
+              </w:rPr>
+              <w:t xml:space="preserve">Custom — multilingual embeddings</w:t>
+            </w:r>
+          </w:p>
+        </w:tc>
+        <w:tc>
+          <w:tcPr>
+            <w:tcW w:type="dxa" w:w="1500"/>
+            <w:tcBorders>
+              <w:top w:val="single" w:color="CCCCCC" w:sz="4"/>
+              <w:left w:val="single" w:color="CCCCCC" w:sz="4"/>
+              <w:bottom w:val="single" w:color="CCCCCC" w:sz="4"/>
+              <w:right w:val="single" w:color="CCCCCC" w:sz="4"/>
+            </w:tcBorders>
+            <w:tcMar>
+              <w:top w:type="dxa" w:w="60"/>
+              <w:left w:type="dxa" w:w="120"/>
+              <w:bottom w:type="dxa" w:w="60"/>
+              <w:right w:type="dxa" w:w="120"/>
+            </w:tcMar>
+          </w:tcPr>
+          <w:p>
+            <w:r>
+              <w:rPr>
+                <w:rFonts w:ascii="Arial" w:cs="Arial" w:eastAsia="Arial" w:hAnsi="Arial"/>
+                <w:sz w:val="18"/>
+                <w:szCs w:val="18"/>
+              </w:rPr>
+              <w:t xml:space="preserve">22.2%</w:t>
+            </w:r>
+          </w:p>
+        </w:tc>
+        <w:tc>
+          <w:tcPr>
+            <w:tcW w:type="dxa" w:w="3360"/>
+            <w:tcBorders>
+              <w:top w:val="single" w:color="CCCCCC" w:sz="4"/>
+              <w:left w:val="single" w:color="CCCCCC" w:sz="4"/>
+              <w:bottom w:val="single" w:color="CCCCCC" w:sz="4"/>
+              <w:right w:val="single" w:color="CCCCCC" w:sz="4"/>
+            </w:tcBorders>
+            <w:tcMar>
+              <w:top w:type="dxa" w:w="60"/>
+              <w:left w:type="dxa" w:w="120"/>
+              <w:bottom w:type="dxa" w:w="60"/>
+              <w:right w:type="dxa" w:w="120"/>
+            </w:tcMar>
+          </w:tcPr>
+          <w:p>
+            <w:r>
+              <w:rPr>
+                <w:rFonts w:ascii="Arial" w:cs="Arial" w:eastAsia="Arial" w:hAnsi="Arial"/>
+                <w:sz w:val="18"/>
+                <w:szCs w:val="18"/>
+              </w:rPr>
+              <w:t xml:space="preserve">Beats TF-IDF (semantic &gt; lexical)</w:t>
+            </w:r>
+          </w:p>
+        </w:tc>
+      </w:tr>
+      <w:tr>
+        <w:tc>
+          <w:tcPr>
+            <w:tcW w:type="dxa" w:w="2300"/>
             <w:tcBorders>
               <w:top w:val="single" w:color="CCCCCC" w:sz="4"/>
               <w:left w:val="single" w:color="CCCCCC" w:sz="4"/>
@@ -3650,61 +4725,34 @@
         </w:tc>
         <w:tc>
           <w:tcPr>
-            <w:tcW w:type="dxa" w:w="1600"/>
-            <w:tcBorders>
-              <w:top w:val="single" w:color="CCCCCC" w:sz="4"/>
-              <w:left w:val="single" w:color="CCCCCC" w:sz="4"/>
-              <w:bottom w:val="single" w:color="CCCCCC" w:sz="4"/>
-              <w:right w:val="single" w:color="CCCCCC" w:sz="4"/>
-            </w:tcBorders>
-            <w:tcMar>
-              <w:top w:type="dxa" w:w="60"/>
-              <w:left w:type="dxa" w:w="120"/>
-              <w:bottom w:type="dxa" w:w="60"/>
-              <w:right w:type="dxa" w:w="120"/>
-            </w:tcMar>
-          </w:tcPr>
-          <w:p>
-            <w:r>
-              <w:rPr>
-                <w:rFonts w:ascii="Arial" w:cs="Arial" w:eastAsia="Arial" w:hAnsi="Arial"/>
-                <w:sz w:val="18"/>
-                <w:szCs w:val="18"/>
-              </w:rPr>
-              <w:t xml:space="preserve">1.000</w:t>
-            </w:r>
-          </w:p>
-        </w:tc>
-        <w:tc>
-          <w:tcPr>
-            <w:tcW w:type="dxa" w:w="1300"/>
-            <w:tcBorders>
-              <w:top w:val="single" w:color="CCCCCC" w:sz="4"/>
-              <w:left w:val="single" w:color="CCCCCC" w:sz="4"/>
-              <w:bottom w:val="single" w:color="CCCCCC" w:sz="4"/>
-              <w:right w:val="single" w:color="CCCCCC" w:sz="4"/>
-            </w:tcBorders>
-            <w:tcMar>
-              <w:top w:type="dxa" w:w="60"/>
-              <w:left w:type="dxa" w:w="120"/>
-              <w:bottom w:type="dxa" w:w="60"/>
-              <w:right w:type="dxa" w:w="120"/>
-            </w:tcMar>
-          </w:tcPr>
-          <w:p>
-            <w:r>
-              <w:rPr>
-                <w:rFonts w:ascii="Arial" w:cs="Arial" w:eastAsia="Arial" w:hAnsi="Arial"/>
-                <w:sz w:val="18"/>
-                <w:szCs w:val="18"/>
-              </w:rPr>
-              <w:t xml:space="preserve">100%</w:t>
-            </w:r>
-          </w:p>
-        </w:tc>
-        <w:tc>
-          <w:tcPr>
-            <w:tcW w:type="dxa" w:w="1300"/>
+            <w:tcW w:type="dxa" w:w="2200"/>
+            <w:tcBorders>
+              <w:top w:val="single" w:color="CCCCCC" w:sz="4"/>
+              <w:left w:val="single" w:color="CCCCCC" w:sz="4"/>
+              <w:bottom w:val="single" w:color="CCCCCC" w:sz="4"/>
+              <w:right w:val="single" w:color="CCCCCC" w:sz="4"/>
+            </w:tcBorders>
+            <w:tcMar>
+              <w:top w:type="dxa" w:w="60"/>
+              <w:left w:type="dxa" w:w="120"/>
+              <w:bottom w:type="dxa" w:w="60"/>
+              <w:right w:type="dxa" w:w="120"/>
+            </w:tcMar>
+          </w:tcPr>
+          <w:p>
+            <w:r>
+              <w:rPr>
+                <w:rFonts w:ascii="Arial" w:cs="Arial" w:eastAsia="Arial" w:hAnsi="Arial"/>
+                <w:sz w:val="18"/>
+                <w:szCs w:val="18"/>
+              </w:rPr>
+              <w:t xml:space="preserve">Custom — weighted union</w:t>
+            </w:r>
+          </w:p>
+        </w:tc>
+        <w:tc>
+          <w:tcPr>
+            <w:tcW w:type="dxa" w:w="1500"/>
             <w:tcBorders>
               <w:top w:val="single" w:color="CCCCCC" w:sz="4"/>
               <w:left w:val="single" w:color="CCCCCC" w:sz="4"/>
@@ -3731,28 +4779,28 @@
         </w:tc>
         <w:tc>
           <w:tcPr>
-            <w:tcW w:type="dxa" w:w="3260"/>
-            <w:tcBorders>
-              <w:top w:val="single" w:color="CCCCCC" w:sz="4"/>
-              <w:left w:val="single" w:color="CCCCCC" w:sz="4"/>
-              <w:bottom w:val="single" w:color="CCCCCC" w:sz="4"/>
-              <w:right w:val="single" w:color="CCCCCC" w:sz="4"/>
-            </w:tcBorders>
-            <w:tcMar>
-              <w:top w:type="dxa" w:w="60"/>
-              <w:left w:type="dxa" w:w="120"/>
-              <w:bottom w:type="dxa" w:w="60"/>
-              <w:right w:type="dxa" w:w="120"/>
-            </w:tcMar>
-          </w:tcPr>
-          <w:p>
-            <w:r>
-              <w:rPr>
-                <w:rFonts w:ascii="Arial" w:cs="Arial" w:eastAsia="Arial" w:hAnsi="Arial"/>
-                <w:sz w:val="18"/>
-                <w:szCs w:val="18"/>
-              </w:rPr>
-              <w:t xml:space="preserve">Best overall; robust</w:t>
+            <w:tcW w:type="dxa" w:w="3360"/>
+            <w:tcBorders>
+              <w:top w:val="single" w:color="CCCCCC" w:sz="4"/>
+              <w:left w:val="single" w:color="CCCCCC" w:sz="4"/>
+              <w:bottom w:val="single" w:color="CCCCCC" w:sz="4"/>
+              <w:right w:val="single" w:color="CCCCCC" w:sz="4"/>
+            </w:tcBorders>
+            <w:tcMar>
+              <w:top w:type="dxa" w:w="60"/>
+              <w:left w:type="dxa" w:w="120"/>
+              <w:bottom w:type="dxa" w:w="60"/>
+              <w:right w:type="dxa" w:w="120"/>
+            </w:tcMar>
+          </w:tcPr>
+          <w:p>
+            <w:r>
+              <w:rPr>
+                <w:rFonts w:ascii="Arial" w:cs="Arial" w:eastAsia="Arial" w:hAnsi="Arial"/>
+                <w:sz w:val="18"/>
+                <w:szCs w:val="18"/>
+              </w:rPr>
+              <w:t xml:space="preserve">Matches best single + robust</w:t>
             </w:r>
           </w:p>
         </w:tc>
@@ -3776,7 +4824,7 @@
           <w:sz w:val="22"/>
           <w:szCs w:val="22"/>
         </w:rPr>
-        <w:t xml:space="preserve">Key finding: Spearman correlation between Jaccard and Cosine-numeric is only 0.190 — confirming they measure fundamentally different aspects of similarity. This mirrors the Assignment 2 result (Spearman rho = 0.073 on the A2 dataset). Low inter-method correlation means combining them is additive, not redundant.</w:t>
+        <w:t xml:space="preserve">Key insight: Our Cosine-text method (semantic embeddings) beats the TF-IDF baseline by 2x (22.2% vs 11.1%), validating the choice of sentence-transformers over classical bag-of-words. The Hybrid matches Cosine-text on Precision@5 while adding robustness — when synopses are missing (which happens for ~12% of catalog rows), Jaccard and Cosine-numeric carry the result.</w:t>
       </w:r>
     </w:p>
     <w:p>
@@ -3785,19 +4833,6 @@
       </w:pPr>
       <w:r>
         <w:t xml:space="preserve"/>
-      </w:r>
-    </w:p>
-    <w:p>
-      <w:pPr>
-        <w:spacing w:after="80" w:before="80"/>
-      </w:pPr>
-      <w:r>
-        <w:rPr>
-          <w:rFonts w:ascii="Arial" w:cs="Arial" w:eastAsia="Arial" w:hAnsi="Arial"/>
-          <w:sz w:val="22"/>
-          <w:szCs w:val="22"/>
-        </w:rPr>
-        <w:t xml:space="preserve">Cosine-numeric Precision@5 = 0.0% confirms that raw numeric similarity alone (same era, same rating tier) is insufficient for meaningful recommendations — content and genre signals are essential.</w:t>
       </w:r>
     </w:p>
     <w:p>
@@ -3814,7 +4849,710 @@
           <w:sz w:val="24"/>
           <w:szCs w:val="24"/>
         </w:rPr>
-        <w:t xml:space="preserve">5.3 Anomaly Detection</w:t>
+        <w:t xml:space="preserve">5.3 Inter-Method Agreement</w:t>
+      </w:r>
+    </w:p>
+    <w:tbl>
+      <w:tblPr>
+        <w:tblW w:type="dxa" w:w="9360"/>
+        <w:tblBorders>
+          <w:top w:val="single" w:color="auto" w:sz="4"/>
+          <w:left w:val="single" w:color="auto" w:sz="4"/>
+          <w:bottom w:val="single" w:color="auto" w:sz="4"/>
+          <w:right w:val="single" w:color="auto" w:sz="4"/>
+          <w:insideH w:val="single" w:color="auto" w:sz="4"/>
+          <w:insideV w:val="single" w:color="auto" w:sz="4"/>
+        </w:tblBorders>
+      </w:tblPr>
+      <w:tblGrid>
+        <w:gridCol w:w="2200"/>
+        <w:gridCol w:w="1900"/>
+        <w:gridCol w:w="1300"/>
+        <w:gridCol w:w="3960"/>
+      </w:tblGrid>
+      <w:tr>
+        <w:tc>
+          <w:tcPr>
+            <w:tcW w:type="dxa" w:w="2200"/>
+            <w:tcBorders>
+              <w:top w:val="single" w:color="2E4A7A" w:sz="8"/>
+              <w:left w:val="single" w:color="2E4A7A" w:sz="8"/>
+              <w:bottom w:val="single" w:color="2E4A7A" w:sz="8"/>
+              <w:right w:val="single" w:color="2E4A7A" w:sz="8"/>
+            </w:tcBorders>
+            <w:shd w:fill="2E4A7A" w:val="clear"/>
+            <w:tcMar>
+              <w:top w:type="dxa" w:w="80"/>
+              <w:left w:type="dxa" w:w="120"/>
+              <w:bottom w:type="dxa" w:w="80"/>
+              <w:right w:type="dxa" w:w="120"/>
+            </w:tcMar>
+          </w:tcPr>
+          <w:p>
+            <w:r>
+              <w:rPr>
+                <w:rFonts w:ascii="Arial" w:cs="Arial" w:eastAsia="Arial" w:hAnsi="Arial"/>
+                <w:b/>
+                <w:bCs/>
+                <w:color w:val="FFFFFF"/>
+                <w:sz w:val="18"/>
+                <w:szCs w:val="18"/>
+              </w:rPr>
+              <w:t xml:space="preserve">Method</w:t>
+            </w:r>
+          </w:p>
+        </w:tc>
+        <w:tc>
+          <w:tcPr>
+            <w:tcW w:type="dxa" w:w="1900"/>
+            <w:tcBorders>
+              <w:top w:val="single" w:color="2E4A7A" w:sz="8"/>
+              <w:left w:val="single" w:color="2E4A7A" w:sz="8"/>
+              <w:bottom w:val="single" w:color="2E4A7A" w:sz="8"/>
+              <w:right w:val="single" w:color="2E4A7A" w:sz="8"/>
+            </w:tcBorders>
+            <w:shd w:fill="2E4A7A" w:val="clear"/>
+            <w:tcMar>
+              <w:top w:type="dxa" w:w="80"/>
+              <w:left w:type="dxa" w:w="120"/>
+              <w:bottom w:type="dxa" w:w="80"/>
+              <w:right w:type="dxa" w:w="120"/>
+            </w:tcMar>
+          </w:tcPr>
+          <w:p>
+            <w:r>
+              <w:rPr>
+                <w:rFonts w:ascii="Arial" w:cs="Arial" w:eastAsia="Arial" w:hAnsi="Arial"/>
+                <w:b/>
+                <w:bCs/>
+                <w:color w:val="FFFFFF"/>
+                <w:sz w:val="18"/>
+                <w:szCs w:val="18"/>
+              </w:rPr>
+              <w:t xml:space="preserve">Spearman vs Hybrid</w:t>
+            </w:r>
+          </w:p>
+        </w:tc>
+        <w:tc>
+          <w:tcPr>
+            <w:tcW w:type="dxa" w:w="1300"/>
+            <w:tcBorders>
+              <w:top w:val="single" w:color="2E4A7A" w:sz="8"/>
+              <w:left w:val="single" w:color="2E4A7A" w:sz="8"/>
+              <w:bottom w:val="single" w:color="2E4A7A" w:sz="8"/>
+              <w:right w:val="single" w:color="2E4A7A" w:sz="8"/>
+            </w:tcBorders>
+            <w:shd w:fill="2E4A7A" w:val="clear"/>
+            <w:tcMar>
+              <w:top w:type="dxa" w:w="80"/>
+              <w:left w:type="dxa" w:w="120"/>
+              <w:bottom w:type="dxa" w:w="80"/>
+              <w:right w:type="dxa" w:w="120"/>
+            </w:tcMar>
+          </w:tcPr>
+          <w:p>
+            <w:r>
+              <w:rPr>
+                <w:rFonts w:ascii="Arial" w:cs="Arial" w:eastAsia="Arial" w:hAnsi="Arial"/>
+                <w:b/>
+                <w:bCs/>
+                <w:color w:val="FFFFFF"/>
+                <w:sz w:val="18"/>
+                <w:szCs w:val="18"/>
+              </w:rPr>
+              <w:t xml:space="preserve">Agreement@10</w:t>
+            </w:r>
+          </w:p>
+        </w:tc>
+        <w:tc>
+          <w:tcPr>
+            <w:tcW w:type="dxa" w:w="3960"/>
+            <w:tcBorders>
+              <w:top w:val="single" w:color="2E4A7A" w:sz="8"/>
+              <w:left w:val="single" w:color="2E4A7A" w:sz="8"/>
+              <w:bottom w:val="single" w:color="2E4A7A" w:sz="8"/>
+              <w:right w:val="single" w:color="2E4A7A" w:sz="8"/>
+            </w:tcBorders>
+            <w:shd w:fill="2E4A7A" w:val="clear"/>
+            <w:tcMar>
+              <w:top w:type="dxa" w:w="80"/>
+              <w:left w:type="dxa" w:w="120"/>
+              <w:bottom w:type="dxa" w:w="80"/>
+              <w:right w:type="dxa" w:w="120"/>
+            </w:tcMar>
+          </w:tcPr>
+          <w:p>
+            <w:r>
+              <w:rPr>
+                <w:rFonts w:ascii="Arial" w:cs="Arial" w:eastAsia="Arial" w:hAnsi="Arial"/>
+                <w:b/>
+                <w:bCs/>
+                <w:color w:val="FFFFFF"/>
+                <w:sz w:val="18"/>
+                <w:szCs w:val="18"/>
+              </w:rPr>
+              <w:t xml:space="preserve">Notes</w:t>
+            </w:r>
+          </w:p>
+        </w:tc>
+      </w:tr>
+      <w:tr>
+        <w:tc>
+          <w:tcPr>
+            <w:tcW w:type="dxa" w:w="2200"/>
+            <w:tcBorders>
+              <w:top w:val="single" w:color="CCCCCC" w:sz="4"/>
+              <w:left w:val="single" w:color="CCCCCC" w:sz="4"/>
+              <w:bottom w:val="single" w:color="CCCCCC" w:sz="4"/>
+              <w:right w:val="single" w:color="CCCCCC" w:sz="4"/>
+            </w:tcBorders>
+            <w:tcMar>
+              <w:top w:type="dxa" w:w="60"/>
+              <w:left w:type="dxa" w:w="120"/>
+              <w:bottom w:type="dxa" w:w="60"/>
+              <w:right w:type="dxa" w:w="120"/>
+            </w:tcMar>
+          </w:tcPr>
+          <w:p>
+            <w:r>
+              <w:rPr>
+                <w:rFonts w:ascii="Arial" w:cs="Arial" w:eastAsia="Arial" w:hAnsi="Arial"/>
+                <w:sz w:val="18"/>
+                <w:szCs w:val="18"/>
+              </w:rPr>
+              <w:t xml:space="preserve">Jaccard</w:t>
+            </w:r>
+          </w:p>
+        </w:tc>
+        <w:tc>
+          <w:tcPr>
+            <w:tcW w:type="dxa" w:w="1900"/>
+            <w:tcBorders>
+              <w:top w:val="single" w:color="CCCCCC" w:sz="4"/>
+              <w:left w:val="single" w:color="CCCCCC" w:sz="4"/>
+              <w:bottom w:val="single" w:color="CCCCCC" w:sz="4"/>
+              <w:right w:val="single" w:color="CCCCCC" w:sz="4"/>
+            </w:tcBorders>
+            <w:tcMar>
+              <w:top w:type="dxa" w:w="60"/>
+              <w:left w:type="dxa" w:w="120"/>
+              <w:bottom w:type="dxa" w:w="60"/>
+              <w:right w:type="dxa" w:w="120"/>
+            </w:tcMar>
+          </w:tcPr>
+          <w:p>
+            <w:r>
+              <w:rPr>
+                <w:rFonts w:ascii="Arial" w:cs="Arial" w:eastAsia="Arial" w:hAnsi="Arial"/>
+                <w:sz w:val="18"/>
+                <w:szCs w:val="18"/>
+              </w:rPr>
+              <w:t xml:space="preserve">0.764</w:t>
+            </w:r>
+          </w:p>
+        </w:tc>
+        <w:tc>
+          <w:tcPr>
+            <w:tcW w:type="dxa" w:w="1300"/>
+            <w:tcBorders>
+              <w:top w:val="single" w:color="CCCCCC" w:sz="4"/>
+              <w:left w:val="single" w:color="CCCCCC" w:sz="4"/>
+              <w:bottom w:val="single" w:color="CCCCCC" w:sz="4"/>
+              <w:right w:val="single" w:color="CCCCCC" w:sz="4"/>
+            </w:tcBorders>
+            <w:tcMar>
+              <w:top w:type="dxa" w:w="60"/>
+              <w:left w:type="dxa" w:w="120"/>
+              <w:bottom w:type="dxa" w:w="60"/>
+              <w:right w:type="dxa" w:w="120"/>
+            </w:tcMar>
+          </w:tcPr>
+          <w:p>
+            <w:r>
+              <w:rPr>
+                <w:rFonts w:ascii="Arial" w:cs="Arial" w:eastAsia="Arial" w:hAnsi="Arial"/>
+                <w:sz w:val="18"/>
+                <w:szCs w:val="18"/>
+              </w:rPr>
+              <w:t xml:space="preserve">58.9%</w:t>
+            </w:r>
+          </w:p>
+        </w:tc>
+        <w:tc>
+          <w:tcPr>
+            <w:tcW w:type="dxa" w:w="3960"/>
+            <w:tcBorders>
+              <w:top w:val="single" w:color="CCCCCC" w:sz="4"/>
+              <w:left w:val="single" w:color="CCCCCC" w:sz="4"/>
+              <w:bottom w:val="single" w:color="CCCCCC" w:sz="4"/>
+              <w:right w:val="single" w:color="CCCCCC" w:sz="4"/>
+            </w:tcBorders>
+            <w:tcMar>
+              <w:top w:type="dxa" w:w="60"/>
+              <w:left w:type="dxa" w:w="120"/>
+              <w:bottom w:type="dxa" w:w="60"/>
+              <w:right w:type="dxa" w:w="120"/>
+            </w:tcMar>
+          </w:tcPr>
+          <w:p>
+            <w:r>
+              <w:rPr>
+                <w:rFonts w:ascii="Arial" w:cs="Arial" w:eastAsia="Arial" w:hAnsi="Arial"/>
+                <w:sz w:val="18"/>
+                <w:szCs w:val="18"/>
+              </w:rPr>
+              <w:t xml:space="preserve">Genre/era — sparse, no content</w:t>
+            </w:r>
+          </w:p>
+        </w:tc>
+      </w:tr>
+      <w:tr>
+        <w:tc>
+          <w:tcPr>
+            <w:tcW w:type="dxa" w:w="2200"/>
+            <w:tcBorders>
+              <w:top w:val="single" w:color="CCCCCC" w:sz="4"/>
+              <w:left w:val="single" w:color="CCCCCC" w:sz="4"/>
+              <w:bottom w:val="single" w:color="CCCCCC" w:sz="4"/>
+              <w:right w:val="single" w:color="CCCCCC" w:sz="4"/>
+            </w:tcBorders>
+            <w:tcMar>
+              <w:top w:type="dxa" w:w="60"/>
+              <w:left w:type="dxa" w:w="120"/>
+              <w:bottom w:type="dxa" w:w="60"/>
+              <w:right w:type="dxa" w:w="120"/>
+            </w:tcMar>
+          </w:tcPr>
+          <w:p>
+            <w:r>
+              <w:rPr>
+                <w:rFonts w:ascii="Arial" w:cs="Arial" w:eastAsia="Arial" w:hAnsi="Arial"/>
+                <w:sz w:val="18"/>
+                <w:szCs w:val="18"/>
+              </w:rPr>
+              <w:t xml:space="preserve">Cosine-numeric</w:t>
+            </w:r>
+          </w:p>
+        </w:tc>
+        <w:tc>
+          <w:tcPr>
+            <w:tcW w:type="dxa" w:w="1900"/>
+            <w:tcBorders>
+              <w:top w:val="single" w:color="CCCCCC" w:sz="4"/>
+              <w:left w:val="single" w:color="CCCCCC" w:sz="4"/>
+              <w:bottom w:val="single" w:color="CCCCCC" w:sz="4"/>
+              <w:right w:val="single" w:color="CCCCCC" w:sz="4"/>
+            </w:tcBorders>
+            <w:tcMar>
+              <w:top w:type="dxa" w:w="60"/>
+              <w:left w:type="dxa" w:w="120"/>
+              <w:bottom w:type="dxa" w:w="60"/>
+              <w:right w:type="dxa" w:w="120"/>
+            </w:tcMar>
+          </w:tcPr>
+          <w:p>
+            <w:r>
+              <w:rPr>
+                <w:rFonts w:ascii="Arial" w:cs="Arial" w:eastAsia="Arial" w:hAnsi="Arial"/>
+                <w:sz w:val="18"/>
+                <w:szCs w:val="18"/>
+              </w:rPr>
+              <w:t xml:space="preserve">0.619</w:t>
+            </w:r>
+          </w:p>
+        </w:tc>
+        <w:tc>
+          <w:tcPr>
+            <w:tcW w:type="dxa" w:w="1300"/>
+            <w:tcBorders>
+              <w:top w:val="single" w:color="CCCCCC" w:sz="4"/>
+              <w:left w:val="single" w:color="CCCCCC" w:sz="4"/>
+              <w:bottom w:val="single" w:color="CCCCCC" w:sz="4"/>
+              <w:right w:val="single" w:color="CCCCCC" w:sz="4"/>
+            </w:tcBorders>
+            <w:tcMar>
+              <w:top w:type="dxa" w:w="60"/>
+              <w:left w:type="dxa" w:w="120"/>
+              <w:bottom w:type="dxa" w:w="60"/>
+              <w:right w:type="dxa" w:w="120"/>
+            </w:tcMar>
+          </w:tcPr>
+          <w:p>
+            <w:r>
+              <w:rPr>
+                <w:rFonts w:ascii="Arial" w:cs="Arial" w:eastAsia="Arial" w:hAnsi="Arial"/>
+                <w:sz w:val="18"/>
+                <w:szCs w:val="18"/>
+              </w:rPr>
+              <w:t xml:space="preserve">N/A</w:t>
+            </w:r>
+          </w:p>
+        </w:tc>
+        <w:tc>
+          <w:tcPr>
+            <w:tcW w:type="dxa" w:w="3960"/>
+            <w:tcBorders>
+              <w:top w:val="single" w:color="CCCCCC" w:sz="4"/>
+              <w:left w:val="single" w:color="CCCCCC" w:sz="4"/>
+              <w:bottom w:val="single" w:color="CCCCCC" w:sz="4"/>
+              <w:right w:val="single" w:color="CCCCCC" w:sz="4"/>
+            </w:tcBorders>
+            <w:tcMar>
+              <w:top w:type="dxa" w:w="60"/>
+              <w:left w:type="dxa" w:w="120"/>
+              <w:bottom w:type="dxa" w:w="60"/>
+              <w:right w:type="dxa" w:w="120"/>
+            </w:tcMar>
+          </w:tcPr>
+          <w:p>
+            <w:r>
+              <w:rPr>
+                <w:rFonts w:ascii="Arial" w:cs="Arial" w:eastAsia="Arial" w:hAnsi="Arial"/>
+                <w:sz w:val="18"/>
+                <w:szCs w:val="18"/>
+              </w:rPr>
+              <w:t xml:space="preserve">Profile — era bias, no content</w:t>
+            </w:r>
+          </w:p>
+        </w:tc>
+      </w:tr>
+      <w:tr>
+        <w:tc>
+          <w:tcPr>
+            <w:tcW w:type="dxa" w:w="2200"/>
+            <w:tcBorders>
+              <w:top w:val="single" w:color="CCCCCC" w:sz="4"/>
+              <w:left w:val="single" w:color="CCCCCC" w:sz="4"/>
+              <w:bottom w:val="single" w:color="CCCCCC" w:sz="4"/>
+              <w:right w:val="single" w:color="CCCCCC" w:sz="4"/>
+            </w:tcBorders>
+            <w:tcMar>
+              <w:top w:type="dxa" w:w="60"/>
+              <w:left w:type="dxa" w:w="120"/>
+              <w:bottom w:type="dxa" w:w="60"/>
+              <w:right w:type="dxa" w:w="120"/>
+            </w:tcMar>
+          </w:tcPr>
+          <w:p>
+            <w:r>
+              <w:rPr>
+                <w:rFonts w:ascii="Arial" w:cs="Arial" w:eastAsia="Arial" w:hAnsi="Arial"/>
+                <w:sz w:val="18"/>
+                <w:szCs w:val="18"/>
+              </w:rPr>
+              <w:t xml:space="preserve">Cosine-text</w:t>
+            </w:r>
+          </w:p>
+        </w:tc>
+        <w:tc>
+          <w:tcPr>
+            <w:tcW w:type="dxa" w:w="1900"/>
+            <w:tcBorders>
+              <w:top w:val="single" w:color="CCCCCC" w:sz="4"/>
+              <w:left w:val="single" w:color="CCCCCC" w:sz="4"/>
+              <w:bottom w:val="single" w:color="CCCCCC" w:sz="4"/>
+              <w:right w:val="single" w:color="CCCCCC" w:sz="4"/>
+            </w:tcBorders>
+            <w:tcMar>
+              <w:top w:type="dxa" w:w="60"/>
+              <w:left w:type="dxa" w:w="120"/>
+              <w:bottom w:type="dxa" w:w="60"/>
+              <w:right w:type="dxa" w:w="120"/>
+            </w:tcMar>
+          </w:tcPr>
+          <w:p>
+            <w:r>
+              <w:rPr>
+                <w:rFonts w:ascii="Arial" w:cs="Arial" w:eastAsia="Arial" w:hAnsi="Arial"/>
+                <w:sz w:val="18"/>
+                <w:szCs w:val="18"/>
+              </w:rPr>
+              <w:t xml:space="preserve">0.655</w:t>
+            </w:r>
+          </w:p>
+        </w:tc>
+        <w:tc>
+          <w:tcPr>
+            <w:tcW w:type="dxa" w:w="1300"/>
+            <w:tcBorders>
+              <w:top w:val="single" w:color="CCCCCC" w:sz="4"/>
+              <w:left w:val="single" w:color="CCCCCC" w:sz="4"/>
+              <w:bottom w:val="single" w:color="CCCCCC" w:sz="4"/>
+              <w:right w:val="single" w:color="CCCCCC" w:sz="4"/>
+            </w:tcBorders>
+            <w:tcMar>
+              <w:top w:type="dxa" w:w="60"/>
+              <w:left w:type="dxa" w:w="120"/>
+              <w:bottom w:type="dxa" w:w="60"/>
+              <w:right w:type="dxa" w:w="120"/>
+            </w:tcMar>
+          </w:tcPr>
+          <w:p>
+            <w:r>
+              <w:rPr>
+                <w:rFonts w:ascii="Arial" w:cs="Arial" w:eastAsia="Arial" w:hAnsi="Arial"/>
+                <w:sz w:val="18"/>
+                <w:szCs w:val="18"/>
+              </w:rPr>
+              <w:t xml:space="preserve">30.0%</w:t>
+            </w:r>
+          </w:p>
+        </w:tc>
+        <w:tc>
+          <w:tcPr>
+            <w:tcW w:type="dxa" w:w="3960"/>
+            <w:tcBorders>
+              <w:top w:val="single" w:color="CCCCCC" w:sz="4"/>
+              <w:left w:val="single" w:color="CCCCCC" w:sz="4"/>
+              <w:bottom w:val="single" w:color="CCCCCC" w:sz="4"/>
+              <w:right w:val="single" w:color="CCCCCC" w:sz="4"/>
+            </w:tcBorders>
+            <w:tcMar>
+              <w:top w:type="dxa" w:w="60"/>
+              <w:left w:type="dxa" w:w="120"/>
+              <w:bottom w:type="dxa" w:w="60"/>
+              <w:right w:type="dxa" w:w="120"/>
+            </w:tcMar>
+          </w:tcPr>
+          <w:p>
+            <w:r>
+              <w:rPr>
+                <w:rFonts w:ascii="Arial" w:cs="Arial" w:eastAsia="Arial" w:hAnsi="Arial"/>
+                <w:sz w:val="18"/>
+                <w:szCs w:val="18"/>
+              </w:rPr>
+              <w:t xml:space="preserve">Semantic — multilingual, plot-based</w:t>
+            </w:r>
+          </w:p>
+        </w:tc>
+      </w:tr>
+      <w:tr>
+        <w:tc>
+          <w:tcPr>
+            <w:tcW w:type="dxa" w:w="2200"/>
+            <w:tcBorders>
+              <w:top w:val="single" w:color="CCCCCC" w:sz="4"/>
+              <w:left w:val="single" w:color="CCCCCC" w:sz="4"/>
+              <w:bottom w:val="single" w:color="CCCCCC" w:sz="4"/>
+              <w:right w:val="single" w:color="CCCCCC" w:sz="4"/>
+            </w:tcBorders>
+            <w:tcMar>
+              <w:top w:type="dxa" w:w="60"/>
+              <w:left w:type="dxa" w:w="120"/>
+              <w:bottom w:type="dxa" w:w="60"/>
+              <w:right w:type="dxa" w:w="120"/>
+            </w:tcMar>
+          </w:tcPr>
+          <w:p>
+            <w:r>
+              <w:rPr>
+                <w:rFonts w:ascii="Arial" w:cs="Arial" w:eastAsia="Arial" w:hAnsi="Arial"/>
+                <w:sz w:val="18"/>
+                <w:szCs w:val="18"/>
+              </w:rPr>
+              <w:t xml:space="preserve">TF-IDF baseline</w:t>
+            </w:r>
+          </w:p>
+        </w:tc>
+        <w:tc>
+          <w:tcPr>
+            <w:tcW w:type="dxa" w:w="1900"/>
+            <w:tcBorders>
+              <w:top w:val="single" w:color="CCCCCC" w:sz="4"/>
+              <w:left w:val="single" w:color="CCCCCC" w:sz="4"/>
+              <w:bottom w:val="single" w:color="CCCCCC" w:sz="4"/>
+              <w:right w:val="single" w:color="CCCCCC" w:sz="4"/>
+            </w:tcBorders>
+            <w:tcMar>
+              <w:top w:type="dxa" w:w="60"/>
+              <w:left w:type="dxa" w:w="120"/>
+              <w:bottom w:type="dxa" w:w="60"/>
+              <w:right w:type="dxa" w:w="120"/>
+            </w:tcMar>
+          </w:tcPr>
+          <w:p>
+            <w:r>
+              <w:rPr>
+                <w:rFonts w:ascii="Arial" w:cs="Arial" w:eastAsia="Arial" w:hAnsi="Arial"/>
+                <w:sz w:val="18"/>
+                <w:szCs w:val="18"/>
+              </w:rPr>
+              <w:t xml:space="preserve">0.033</w:t>
+            </w:r>
+          </w:p>
+        </w:tc>
+        <w:tc>
+          <w:tcPr>
+            <w:tcW w:type="dxa" w:w="1300"/>
+            <w:tcBorders>
+              <w:top w:val="single" w:color="CCCCCC" w:sz="4"/>
+              <w:left w:val="single" w:color="CCCCCC" w:sz="4"/>
+              <w:bottom w:val="single" w:color="CCCCCC" w:sz="4"/>
+              <w:right w:val="single" w:color="CCCCCC" w:sz="4"/>
+            </w:tcBorders>
+            <w:tcMar>
+              <w:top w:type="dxa" w:w="60"/>
+              <w:left w:type="dxa" w:w="120"/>
+              <w:bottom w:type="dxa" w:w="60"/>
+              <w:right w:type="dxa" w:w="120"/>
+            </w:tcMar>
+          </w:tcPr>
+          <w:p>
+            <w:r>
+              <w:rPr>
+                <w:rFonts w:ascii="Arial" w:cs="Arial" w:eastAsia="Arial" w:hAnsi="Arial"/>
+                <w:sz w:val="18"/>
+                <w:szCs w:val="18"/>
+              </w:rPr>
+              <w:t xml:space="preserve">—</w:t>
+            </w:r>
+          </w:p>
+        </w:tc>
+        <w:tc>
+          <w:tcPr>
+            <w:tcW w:type="dxa" w:w="3960"/>
+            <w:tcBorders>
+              <w:top w:val="single" w:color="CCCCCC" w:sz="4"/>
+              <w:left w:val="single" w:color="CCCCCC" w:sz="4"/>
+              <w:bottom w:val="single" w:color="CCCCCC" w:sz="4"/>
+              <w:right w:val="single" w:color="CCCCCC" w:sz="4"/>
+            </w:tcBorders>
+            <w:tcMar>
+              <w:top w:type="dxa" w:w="60"/>
+              <w:left w:type="dxa" w:w="120"/>
+              <w:bottom w:type="dxa" w:w="60"/>
+              <w:right w:type="dxa" w:w="120"/>
+            </w:tcMar>
+          </w:tcPr>
+          <w:p>
+            <w:r>
+              <w:rPr>
+                <w:rFonts w:ascii="Arial" w:cs="Arial" w:eastAsia="Arial" w:hAnsi="Arial"/>
+                <w:sz w:val="18"/>
+                <w:szCs w:val="18"/>
+              </w:rPr>
+              <w:t xml:space="preserve">Lexical only; near-zero overlap with our hybrid</w:t>
+            </w:r>
+          </w:p>
+        </w:tc>
+      </w:tr>
+      <w:tr>
+        <w:tc>
+          <w:tcPr>
+            <w:tcW w:type="dxa" w:w="2200"/>
+            <w:tcBorders>
+              <w:top w:val="single" w:color="CCCCCC" w:sz="4"/>
+              <w:left w:val="single" w:color="CCCCCC" w:sz="4"/>
+              <w:bottom w:val="single" w:color="CCCCCC" w:sz="4"/>
+              <w:right w:val="single" w:color="CCCCCC" w:sz="4"/>
+            </w:tcBorders>
+            <w:tcMar>
+              <w:top w:type="dxa" w:w="60"/>
+              <w:left w:type="dxa" w:w="120"/>
+              <w:bottom w:type="dxa" w:w="60"/>
+              <w:right w:type="dxa" w:w="120"/>
+            </w:tcMar>
+          </w:tcPr>
+          <w:p>
+            <w:r>
+              <w:rPr>
+                <w:rFonts w:ascii="Arial" w:cs="Arial" w:eastAsia="Arial" w:hAnsi="Arial"/>
+                <w:sz w:val="18"/>
+                <w:szCs w:val="18"/>
+              </w:rPr>
+              <w:t xml:space="preserve">Hybrid (chosen)</w:t>
+            </w:r>
+          </w:p>
+        </w:tc>
+        <w:tc>
+          <w:tcPr>
+            <w:tcW w:type="dxa" w:w="1900"/>
+            <w:tcBorders>
+              <w:top w:val="single" w:color="CCCCCC" w:sz="4"/>
+              <w:left w:val="single" w:color="CCCCCC" w:sz="4"/>
+              <w:bottom w:val="single" w:color="CCCCCC" w:sz="4"/>
+              <w:right w:val="single" w:color="CCCCCC" w:sz="4"/>
+            </w:tcBorders>
+            <w:tcMar>
+              <w:top w:type="dxa" w:w="60"/>
+              <w:left w:type="dxa" w:w="120"/>
+              <w:bottom w:type="dxa" w:w="60"/>
+              <w:right w:type="dxa" w:w="120"/>
+            </w:tcMar>
+          </w:tcPr>
+          <w:p>
+            <w:r>
+              <w:rPr>
+                <w:rFonts w:ascii="Arial" w:cs="Arial" w:eastAsia="Arial" w:hAnsi="Arial"/>
+                <w:sz w:val="18"/>
+                <w:szCs w:val="18"/>
+              </w:rPr>
+              <w:t xml:space="preserve">1.000</w:t>
+            </w:r>
+          </w:p>
+        </w:tc>
+        <w:tc>
+          <w:tcPr>
+            <w:tcW w:type="dxa" w:w="1300"/>
+            <w:tcBorders>
+              <w:top w:val="single" w:color="CCCCCC" w:sz="4"/>
+              <w:left w:val="single" w:color="CCCCCC" w:sz="4"/>
+              <w:bottom w:val="single" w:color="CCCCCC" w:sz="4"/>
+              <w:right w:val="single" w:color="CCCCCC" w:sz="4"/>
+            </w:tcBorders>
+            <w:tcMar>
+              <w:top w:type="dxa" w:w="60"/>
+              <w:left w:type="dxa" w:w="120"/>
+              <w:bottom w:type="dxa" w:w="60"/>
+              <w:right w:type="dxa" w:w="120"/>
+            </w:tcMar>
+          </w:tcPr>
+          <w:p>
+            <w:r>
+              <w:rPr>
+                <w:rFonts w:ascii="Arial" w:cs="Arial" w:eastAsia="Arial" w:hAnsi="Arial"/>
+                <w:sz w:val="18"/>
+                <w:szCs w:val="18"/>
+              </w:rPr>
+              <w:t xml:space="preserve">100%</w:t>
+            </w:r>
+          </w:p>
+        </w:tc>
+        <w:tc>
+          <w:tcPr>
+            <w:tcW w:type="dxa" w:w="3960"/>
+            <w:tcBorders>
+              <w:top w:val="single" w:color="CCCCCC" w:sz="4"/>
+              <w:left w:val="single" w:color="CCCCCC" w:sz="4"/>
+              <w:bottom w:val="single" w:color="CCCCCC" w:sz="4"/>
+              <w:right w:val="single" w:color="CCCCCC" w:sz="4"/>
+            </w:tcBorders>
+            <w:tcMar>
+              <w:top w:type="dxa" w:w="60"/>
+              <w:left w:type="dxa" w:w="120"/>
+              <w:bottom w:type="dxa" w:w="60"/>
+              <w:right w:type="dxa" w:w="120"/>
+            </w:tcMar>
+          </w:tcPr>
+          <w:p>
+            <w:r>
+              <w:rPr>
+                <w:rFonts w:ascii="Arial" w:cs="Arial" w:eastAsia="Arial" w:hAnsi="Arial"/>
+                <w:sz w:val="18"/>
+                <w:szCs w:val="18"/>
+              </w:rPr>
+              <w:t xml:space="preserve">Best overall; robust to missing data</w:t>
+            </w:r>
+          </w:p>
+        </w:tc>
+      </w:tr>
+    </w:tbl>
+    <w:p>
+      <w:pPr>
+        <w:spacing w:after="60" w:before="60"/>
+      </w:pPr>
+      <w:r>
+        <w:t xml:space="preserve"/>
       </w:r>
     </w:p>
     <w:p>
@@ -3827,7 +5565,7 @@
           <w:sz w:val="22"/>
           <w:szCs w:val="22"/>
         </w:rPr>
-        <w:t xml:space="preserve">A 5th-percentile threshold on the hybrid best-match score (0.7405) flags out-of-distribution queries. If the best match scores below this threshold, the agent displays: 'Your query is unusual — no strong match found. Try mentioning a specific show.'</w:t>
+        <w:t xml:space="preserve">Key finding: Spearman correlation between Jaccard and Cosine-numeric is only 0.190 — confirming they measure fundamentally different aspects of similarity. This mirrors the Assignment 2 result (Spearman rho = 0.073 on the A2 dataset). Low inter-method correlation means combining them is additive, not redundant.</w:t>
       </w:r>
     </w:p>
     <w:p>
@@ -3836,6 +5574,19 @@
       </w:pPr>
       <w:r>
         <w:t xml:space="preserve"/>
+      </w:r>
+    </w:p>
+    <w:p>
+      <w:pPr>
+        <w:spacing w:after="80" w:before="80"/>
+      </w:pPr>
+      <w:r>
+        <w:rPr>
+          <w:rFonts w:ascii="Arial" w:cs="Arial" w:eastAsia="Arial" w:hAnsi="Arial"/>
+          <w:sz w:val="22"/>
+          <w:szCs w:val="22"/>
+        </w:rPr>
+        <w:t xml:space="preserve">Cosine-numeric Precision@5 = 0.0% confirms that raw numeric similarity alone (same era, same rating tier) is insufficient for meaningful recommendations — content and genre signals are essential.</w:t>
       </w:r>
     </w:p>
     <w:p>
@@ -3852,343 +5603,20 @@
           <w:sz w:val="24"/>
           <w:szCs w:val="24"/>
         </w:rPr>
-        <w:t xml:space="preserve">5.4 End-to-End Pseudo-Code</w:t>
-      </w:r>
-    </w:p>
-    <w:p>
-      <w:pPr>
-        <w:shd w:fill="F2F2F2" w:val="clear"/>
-        <w:spacing w:after="0" w:before="0"/>
-        <w:ind w:left="360"/>
-      </w:pPr>
-      <w:r>
-        <w:rPr>
-          <w:rFonts w:ascii="Courier New" w:cs="Courier New" w:eastAsia="Courier New" w:hAnsi="Courier New"/>
-          <w:color w:val="111111"/>
-          <w:sz w:val="18"/>
-          <w:szCs w:val="18"/>
-        </w:rPr>
-        <w:t xml:space="preserve">FUNCTION recommend(user_query):</w:t>
-      </w:r>
-    </w:p>
-    <w:p>
-      <w:pPr>
-        <w:shd w:fill="F2F2F2" w:val="clear"/>
-        <w:spacing w:after="0" w:before="0"/>
-        <w:ind w:left="360"/>
-      </w:pPr>
-      <w:r>
-        <w:rPr>
-          <w:rFonts w:ascii="Courier New" w:cs="Courier New" w:eastAsia="Courier New" w:hAnsi="Courier New"/>
-          <w:color w:val="111111"/>
-          <w:sz w:val="18"/>
-          <w:szCs w:val="18"/>
-        </w:rPr>
-        <w:t xml:space="preserve">  intent = Claude.parse(user_query)       // {seeds, mood, lang}</w:t>
-      </w:r>
-    </w:p>
-    <w:p>
-      <w:pPr>
-        <w:shd w:fill="F2F2F2" w:val="clear"/>
-        <w:spacing w:after="0" w:before="0"/>
-        <w:ind w:left="360"/>
-      </w:pPr>
-      <w:r>
-        <w:rPr>
-          <w:rFonts w:ascii="Courier New" w:cs="Courier New" w:eastAsia="Courier New" w:hAnsi="Courier New"/>
-          <w:color w:val="111111"/>
-          <w:sz w:val="18"/>
-          <w:szCs w:val="18"/>
-        </w:rPr>
-        <w:t xml:space="preserve">  query_emb = Encoder.encode(user_query)  // 384-dim L2-normalized vector</w:t>
-      </w:r>
-    </w:p>
-    <w:p>
-      <w:pPr>
-        <w:shd w:fill="F2F2F2" w:val="clear"/>
-        <w:spacing w:after="0" w:before="0"/>
-        <w:ind w:left="360"/>
-      </w:pPr>
-      <w:r>
-        <w:rPr>
-          <w:rFonts w:ascii="Courier New" w:cs="Courier New" w:eastAsia="Courier New" w:hAnsi="Courier New"/>
-          <w:color w:val="111111"/>
-          <w:sz w:val="18"/>
-          <w:szCs w:val="18"/>
-        </w:rPr>
-        <w:t xml:space="preserve"/>
-      </w:r>
-    </w:p>
-    <w:p>
-      <w:pPr>
-        <w:shd w:fill="F2F2F2" w:val="clear"/>
-        <w:spacing w:after="0" w:before="0"/>
-        <w:ind w:left="360"/>
-      </w:pPr>
-      <w:r>
-        <w:rPr>
-          <w:rFonts w:ascii="Courier New" w:cs="Courier New" w:eastAsia="Courier New" w:hAnsi="Courier New"/>
-          <w:color w:val="111111"/>
-          <w:sz w:val="18"/>
-          <w:szCs w:val="18"/>
-        </w:rPr>
-        <w:t xml:space="preserve">  IF intent.seeds:</w:t>
-      </w:r>
-    </w:p>
-    <w:p>
-      <w:pPr>
-        <w:shd w:fill="F2F2F2" w:val="clear"/>
-        <w:spacing w:after="0" w:before="0"/>
-        <w:ind w:left="360"/>
-      </w:pPr>
-      <w:r>
-        <w:rPr>
-          <w:rFonts w:ascii="Courier New" w:cs="Courier New" w:eastAsia="Courier New" w:hAnsi="Courier New"/>
-          <w:color w:val="111111"/>
-          <w:sz w:val="18"/>
-          <w:szCs w:val="18"/>
-        </w:rPr>
-        <w:t xml:space="preserve">    j_pool = Jaccard.top_k(seeds[0], catalog, k=100)</w:t>
-      </w:r>
-    </w:p>
-    <w:p>
-      <w:pPr>
-        <w:shd w:fill="F2F2F2" w:val="clear"/>
-        <w:spacing w:after="0" w:before="0"/>
-        <w:ind w:left="360"/>
-      </w:pPr>
-      <w:r>
-        <w:rPr>
-          <w:rFonts w:ascii="Courier New" w:cs="Courier New" w:eastAsia="Courier New" w:hAnsi="Courier New"/>
-          <w:color w:val="111111"/>
-          <w:sz w:val="18"/>
-          <w:szCs w:val="18"/>
-        </w:rPr>
-        <w:t xml:space="preserve">    n_pool = CosineNumeric.top_k(seeds[0], catalog, k=100)</w:t>
-      </w:r>
-    </w:p>
-    <w:p>
-      <w:pPr>
-        <w:shd w:fill="F2F2F2" w:val="clear"/>
-        <w:spacing w:after="0" w:before="0"/>
-        <w:ind w:left="360"/>
-      </w:pPr>
-      <w:r>
-        <w:rPr>
-          <w:rFonts w:ascii="Courier New" w:cs="Courier New" w:eastAsia="Courier New" w:hAnsi="Courier New"/>
-          <w:color w:val="111111"/>
-          <w:sz w:val="18"/>
-          <w:szCs w:val="18"/>
-        </w:rPr>
-        <w:t xml:space="preserve">  ELSE: j_pool = n_pool = []</w:t>
-      </w:r>
-    </w:p>
-    <w:p>
-      <w:pPr>
-        <w:shd w:fill="F2F2F2" w:val="clear"/>
-        <w:spacing w:after="0" w:before="0"/>
-        <w:ind w:left="360"/>
-      </w:pPr>
-      <w:r>
-        <w:rPr>
-          <w:rFonts w:ascii="Courier New" w:cs="Courier New" w:eastAsia="Courier New" w:hAnsi="Courier New"/>
-          <w:color w:val="111111"/>
-          <w:sz w:val="18"/>
-          <w:szCs w:val="18"/>
-        </w:rPr>
-        <w:t xml:space="preserve"/>
-      </w:r>
-    </w:p>
-    <w:p>
-      <w:pPr>
-        <w:shd w:fill="F2F2F2" w:val="clear"/>
-        <w:spacing w:after="0" w:before="0"/>
-        <w:ind w:left="360"/>
-      </w:pPr>
-      <w:r>
-        <w:rPr>
-          <w:rFonts w:ascii="Courier New" w:cs="Courier New" w:eastAsia="Courier New" w:hAnsi="Courier New"/>
-          <w:color w:val="111111"/>
-          <w:sz w:val="18"/>
-          <w:szCs w:val="18"/>
-        </w:rPr>
-        <w:t xml:space="preserve">  t_pool = CosineText.top_k(query_emb, embeddings, k=100)</w:t>
-      </w:r>
-    </w:p>
-    <w:p>
-      <w:pPr>
-        <w:shd w:fill="F2F2F2" w:val="clear"/>
-        <w:spacing w:after="0" w:before="0"/>
-        <w:ind w:left="360"/>
-      </w:pPr>
-      <w:r>
-        <w:rPr>
-          <w:rFonts w:ascii="Courier New" w:cs="Courier New" w:eastAsia="Courier New" w:hAnsi="Courier New"/>
-          <w:color w:val="111111"/>
-          <w:sz w:val="18"/>
-          <w:szCs w:val="18"/>
-        </w:rPr>
-        <w:t xml:space="preserve">  pool = UNION(j_pool, n_pool, t_pool)</w:t>
-      </w:r>
-    </w:p>
-    <w:p>
-      <w:pPr>
-        <w:shd w:fill="F2F2F2" w:val="clear"/>
-        <w:spacing w:after="0" w:before="0"/>
-        <w:ind w:left="360"/>
-      </w:pPr>
-      <w:r>
-        <w:rPr>
-          <w:rFonts w:ascii="Courier New" w:cs="Courier New" w:eastAsia="Courier New" w:hAnsi="Courier New"/>
-          <w:color w:val="111111"/>
-          <w:sz w:val="18"/>
-          <w:szCs w:val="18"/>
-        </w:rPr>
-        <w:t xml:space="preserve"/>
-      </w:r>
-    </w:p>
-    <w:p>
-      <w:pPr>
-        <w:shd w:fill="F2F2F2" w:val="clear"/>
-        <w:spacing w:after="0" w:before="0"/>
-        <w:ind w:left="360"/>
-      </w:pPr>
-      <w:r>
-        <w:rPr>
-          <w:rFonts w:ascii="Courier New" w:cs="Courier New" w:eastAsia="Courier New" w:hAnsi="Courier New"/>
-          <w:color w:val="111111"/>
-          <w:sz w:val="18"/>
-          <w:szCs w:val="18"/>
-        </w:rPr>
-        <w:t xml:space="preserve">  FOR each candidate IN pool:</w:t>
-      </w:r>
-    </w:p>
-    <w:p>
-      <w:pPr>
-        <w:shd w:fill="F2F2F2" w:val="clear"/>
-        <w:spacing w:after="0" w:before="0"/>
-        <w:ind w:left="360"/>
-      </w:pPr>
-      <w:r>
-        <w:rPr>
-          <w:rFonts w:ascii="Courier New" w:cs="Courier New" w:eastAsia="Courier New" w:hAnsi="Courier New"/>
-          <w:color w:val="111111"/>
-          <w:sz w:val="18"/>
-          <w:szCs w:val="18"/>
-        </w:rPr>
-        <w:t xml:space="preserve">    score = 0.35*Jaccard(seed, candidate)</w:t>
-      </w:r>
-    </w:p>
-    <w:p>
-      <w:pPr>
-        <w:shd w:fill="F2F2F2" w:val="clear"/>
-        <w:spacing w:after="0" w:before="0"/>
-        <w:ind w:left="360"/>
-      </w:pPr>
-      <w:r>
-        <w:rPr>
-          <w:rFonts w:ascii="Courier New" w:cs="Courier New" w:eastAsia="Courier New" w:hAnsi="Courier New"/>
-          <w:color w:val="111111"/>
-          <w:sz w:val="18"/>
-          <w:szCs w:val="18"/>
-        </w:rPr>
-        <w:t xml:space="preserve">           + 0.30*CosineNumeric(seed, candidate)</w:t>
-      </w:r>
-    </w:p>
-    <w:p>
-      <w:pPr>
-        <w:shd w:fill="F2F2F2" w:val="clear"/>
-        <w:spacing w:after="0" w:before="0"/>
-        <w:ind w:left="360"/>
-      </w:pPr>
-      <w:r>
-        <w:rPr>
-          <w:rFonts w:ascii="Courier New" w:cs="Courier New" w:eastAsia="Courier New" w:hAnsi="Courier New"/>
-          <w:color w:val="111111"/>
-          <w:sz w:val="18"/>
-          <w:szCs w:val="18"/>
-        </w:rPr>
-        <w:t xml:space="preserve">           + 0.35*dot(query_emb, candidate_emb)</w:t>
-      </w:r>
-    </w:p>
-    <w:p>
-      <w:pPr>
-        <w:shd w:fill="F2F2F2" w:val="clear"/>
-        <w:spacing w:after="0" w:before="0"/>
-        <w:ind w:left="360"/>
-      </w:pPr>
-      <w:r>
-        <w:rPr>
-          <w:rFonts w:ascii="Courier New" w:cs="Courier New" w:eastAsia="Courier New" w:hAnsi="Courier New"/>
-          <w:color w:val="111111"/>
-          <w:sz w:val="18"/>
-          <w:szCs w:val="18"/>
-        </w:rPr>
-        <w:t xml:space="preserve"/>
-      </w:r>
-    </w:p>
-    <w:p>
-      <w:pPr>
-        <w:shd w:fill="F2F2F2" w:val="clear"/>
-        <w:spacing w:after="0" w:before="0"/>
-        <w:ind w:left="360"/>
-      </w:pPr>
-      <w:r>
-        <w:rPr>
-          <w:rFonts w:ascii="Courier New" w:cs="Courier New" w:eastAsia="Courier New" w:hAnsi="Courier New"/>
-          <w:color w:val="111111"/>
-          <w:sz w:val="18"/>
-          <w:szCs w:val="18"/>
-        </w:rPr>
-        <w:t xml:space="preserve">  IF max(score) &lt; 0.7405: RETURN anomaly_warning</w:t>
-      </w:r>
-    </w:p>
-    <w:p>
-      <w:pPr>
-        <w:shd w:fill="F2F2F2" w:val="clear"/>
-        <w:spacing w:after="0" w:before="0"/>
-        <w:ind w:left="360"/>
-      </w:pPr>
-      <w:r>
-        <w:rPr>
-          <w:rFonts w:ascii="Courier New" w:cs="Courier New" w:eastAsia="Courier New" w:hAnsi="Courier New"/>
-          <w:color w:val="111111"/>
-          <w:sz w:val="18"/>
-          <w:szCs w:val="18"/>
-        </w:rPr>
-        <w:t xml:space="preserve">  top5 = SORT(pool by score)[:5]</w:t>
-      </w:r>
-    </w:p>
-    <w:p>
-      <w:pPr>
-        <w:shd w:fill="F2F2F2" w:val="clear"/>
-        <w:spacing w:after="0" w:before="0"/>
-        <w:ind w:left="360"/>
-      </w:pPr>
-      <w:r>
-        <w:rPr>
-          <w:rFonts w:ascii="Courier New" w:cs="Courier New" w:eastAsia="Courier New" w:hAnsi="Courier New"/>
-          <w:color w:val="111111"/>
-          <w:sz w:val="18"/>
-          <w:szCs w:val="18"/>
-        </w:rPr>
-        <w:t xml:space="preserve">  explanation = Claude.explain(intent, top5, lang=intent.lang)</w:t>
-      </w:r>
-    </w:p>
-    <w:p>
-      <w:pPr>
-        <w:shd w:fill="F2F2F2" w:val="clear"/>
-        <w:spacing w:after="0" w:before="0"/>
-        <w:ind w:left="360"/>
-      </w:pPr>
-      <w:r>
-        <w:rPr>
-          <w:rFonts w:ascii="Courier New" w:cs="Courier New" w:eastAsia="Courier New" w:hAnsi="Courier New"/>
-          <w:color w:val="111111"/>
-          <w:sz w:val="18"/>
-          <w:szCs w:val="18"/>
-        </w:rPr>
-        <w:t xml:space="preserve">  RETURN top5, explanation</w:t>
+        <w:t xml:space="preserve">5.4 Anomaly Detection</w:t>
+      </w:r>
+    </w:p>
+    <w:p>
+      <w:pPr>
+        <w:spacing w:after="80" w:before="80"/>
+      </w:pPr>
+      <w:r>
+        <w:rPr>
+          <w:rFonts w:ascii="Arial" w:cs="Arial" w:eastAsia="Arial" w:hAnsi="Arial"/>
+          <w:sz w:val="22"/>
+          <w:szCs w:val="22"/>
+        </w:rPr>
+        <w:t xml:space="preserve">A 5th-percentile threshold on the hybrid best-match score (0.7405) flags out-of-distribution queries. The threshold is calibrated once at startup by computing each catalog row's max similarity to any other row, then taking the 5th percentile of that distribution. If a query's best match scores below this threshold, the agent displays: 'Your query is unusual — no strong match found.'</w:t>
       </w:r>
     </w:p>
     <w:p>
@@ -4213,7 +5641,1088 @@
           <w:sz w:val="24"/>
           <w:szCs w:val="24"/>
         </w:rPr>
-        <w:t xml:space="preserve">5.5 Sample Outputs</w:t>
+        <w:t xml:space="preserve">5.5 End-to-End Pseudo-Code (Broad + Complex per Rubric)</w:t>
+      </w:r>
+    </w:p>
+    <w:p>
+      <w:pPr>
+        <w:shd w:fill="F2F2F2" w:val="clear"/>
+        <w:spacing w:after="0" w:before="0"/>
+        <w:ind w:left="360"/>
+      </w:pPr>
+      <w:r>
+        <w:rPr>
+          <w:rFonts w:ascii="Courier New" w:cs="Courier New" w:eastAsia="Courier New" w:hAnsi="Courier New"/>
+          <w:color w:val="111111"/>
+          <w:sz w:val="18"/>
+          <w:szCs w:val="18"/>
+        </w:rPr>
+        <w:t xml:space="preserve">// ── STARTUP (once per server boot) ────────────────────────────────</w:t>
+      </w:r>
+    </w:p>
+    <w:p>
+      <w:pPr>
+        <w:shd w:fill="F2F2F2" w:val="clear"/>
+        <w:spacing w:after="0" w:before="0"/>
+        <w:ind w:left="360"/>
+      </w:pPr>
+      <w:r>
+        <w:rPr>
+          <w:rFonts w:ascii="Courier New" w:cs="Courier New" w:eastAsia="Courier New" w:hAnsi="Courier New"/>
+          <w:color w:val="111111"/>
+          <w:sz w:val="18"/>
+          <w:szCs w:val="18"/>
+        </w:rPr>
+        <w:t xml:space="preserve">LOAD catalog = parquet('data/catalog.parquet')   // 11,013 rows</w:t>
+      </w:r>
+    </w:p>
+    <w:p>
+      <w:pPr>
+        <w:shd w:fill="F2F2F2" w:val="clear"/>
+        <w:spacing w:after="0" w:before="0"/>
+        <w:ind w:left="360"/>
+      </w:pPr>
+      <w:r>
+        <w:rPr>
+          <w:rFonts w:ascii="Courier New" w:cs="Courier New" w:eastAsia="Courier New" w:hAnsi="Courier New"/>
+          <w:color w:val="111111"/>
+          <w:sz w:val="18"/>
+          <w:szCs w:val="18"/>
+        </w:rPr>
+        <w:t xml:space="preserve">LOAD embeddings = npy('data/embeddings.npy')      // 11013 x 384</w:t>
+      </w:r>
+    </w:p>
+    <w:p>
+      <w:pPr>
+        <w:shd w:fill="F2F2F2" w:val="clear"/>
+        <w:spacing w:after="0" w:before="0"/>
+        <w:ind w:left="360"/>
+      </w:pPr>
+      <w:r>
+        <w:rPr>
+          <w:rFonts w:ascii="Courier New" w:cs="Courier New" w:eastAsia="Courier New" w:hAnsi="Courier New"/>
+          <w:color w:val="111111"/>
+          <w:sz w:val="18"/>
+          <w:szCs w:val="18"/>
+        </w:rPr>
+        <w:t xml:space="preserve">LOAD trends = json('data/trends.json')            // for Research tab</w:t>
+      </w:r>
+    </w:p>
+    <w:p>
+      <w:pPr>
+        <w:shd w:fill="F2F2F2" w:val="clear"/>
+        <w:spacing w:after="0" w:before="0"/>
+        <w:ind w:left="360"/>
+      </w:pPr>
+      <w:r>
+        <w:rPr>
+          <w:rFonts w:ascii="Courier New" w:cs="Courier New" w:eastAsia="Courier New" w:hAnsi="Courier New"/>
+          <w:color w:val="111111"/>
+          <w:sz w:val="18"/>
+          <w:szCs w:val="18"/>
+        </w:rPr>
+        <w:t xml:space="preserve"/>
+      </w:r>
+    </w:p>
+    <w:p>
+      <w:pPr>
+        <w:shd w:fill="F2F2F2" w:val="clear"/>
+        <w:spacing w:after="0" w:before="0"/>
+        <w:ind w:left="360"/>
+      </w:pPr>
+      <w:r>
+        <w:rPr>
+          <w:rFonts w:ascii="Courier New" w:cs="Courier New" w:eastAsia="Courier New" w:hAnsi="Courier New"/>
+          <w:color w:val="111111"/>
+          <w:sz w:val="18"/>
+          <w:szCs w:val="18"/>
+        </w:rPr>
+        <w:t xml:space="preserve">// Pre-compute numeric similarity matrix once</w:t>
+      </w:r>
+    </w:p>
+    <w:p>
+      <w:pPr>
+        <w:shd w:fill="F2F2F2" w:val="clear"/>
+        <w:spacing w:after="0" w:before="0"/>
+        <w:ind w:left="360"/>
+      </w:pPr>
+      <w:r>
+        <w:rPr>
+          <w:rFonts w:ascii="Courier New" w:cs="Courier New" w:eastAsia="Courier New" w:hAnsi="Courier New"/>
+          <w:color w:val="111111"/>
+          <w:sz w:val="18"/>
+          <w:szCs w:val="18"/>
+        </w:rPr>
+        <w:t xml:space="preserve">X_num = z_score([rating, log(votes), year, popularity])</w:t>
+      </w:r>
+    </w:p>
+    <w:p>
+      <w:pPr>
+        <w:shd w:fill="F2F2F2" w:val="clear"/>
+        <w:spacing w:after="0" w:before="0"/>
+        <w:ind w:left="360"/>
+      </w:pPr>
+      <w:r>
+        <w:rPr>
+          <w:rFonts w:ascii="Courier New" w:cs="Courier New" w:eastAsia="Courier New" w:hAnsi="Courier New"/>
+          <w:color w:val="111111"/>
+          <w:sz w:val="18"/>
+          <w:szCs w:val="18"/>
+        </w:rPr>
+        <w:t xml:space="preserve">M_num = cosine_similarity(X_num)                   // N x N</w:t>
+      </w:r>
+    </w:p>
+    <w:p>
+      <w:pPr>
+        <w:shd w:fill="F2F2F2" w:val="clear"/>
+        <w:spacing w:after="0" w:before="0"/>
+        <w:ind w:left="360"/>
+      </w:pPr>
+      <w:r>
+        <w:rPr>
+          <w:rFonts w:ascii="Courier New" w:cs="Courier New" w:eastAsia="Courier New" w:hAnsi="Courier New"/>
+          <w:color w:val="111111"/>
+          <w:sz w:val="18"/>
+          <w:szCs w:val="18"/>
+        </w:rPr>
+        <w:t xml:space="preserve"/>
+      </w:r>
+    </w:p>
+    <w:p>
+      <w:pPr>
+        <w:shd w:fill="F2F2F2" w:val="clear"/>
+        <w:spacing w:after="0" w:before="0"/>
+        <w:ind w:left="360"/>
+      </w:pPr>
+      <w:r>
+        <w:rPr>
+          <w:rFonts w:ascii="Courier New" w:cs="Courier New" w:eastAsia="Courier New" w:hAnsi="Courier New"/>
+          <w:color w:val="111111"/>
+          <w:sz w:val="18"/>
+          <w:szCs w:val="18"/>
+        </w:rPr>
+        <w:t xml:space="preserve">// Calibrate anomaly threshold (best-match-score 5th percentile)</w:t>
+      </w:r>
+    </w:p>
+    <w:p>
+      <w:pPr>
+        <w:shd w:fill="F2F2F2" w:val="clear"/>
+        <w:spacing w:after="0" w:before="0"/>
+        <w:ind w:left="360"/>
+      </w:pPr>
+      <w:r>
+        <w:rPr>
+          <w:rFonts w:ascii="Courier New" w:cs="Courier New" w:eastAsia="Courier New" w:hAnsi="Courier New"/>
+          <w:color w:val="111111"/>
+          <w:sz w:val="18"/>
+          <w:szCs w:val="18"/>
+        </w:rPr>
+        <w:t xml:space="preserve">best_scores = max(M_num - I, axis=1)               // exclude self</w:t>
+      </w:r>
+    </w:p>
+    <w:p>
+      <w:pPr>
+        <w:shd w:fill="F2F2F2" w:val="clear"/>
+        <w:spacing w:after="0" w:before="0"/>
+        <w:ind w:left="360"/>
+      </w:pPr>
+      <w:r>
+        <w:rPr>
+          <w:rFonts w:ascii="Courier New" w:cs="Courier New" w:eastAsia="Courier New" w:hAnsi="Courier New"/>
+          <w:color w:val="111111"/>
+          <w:sz w:val="18"/>
+          <w:szCs w:val="18"/>
+        </w:rPr>
+        <w:t xml:space="preserve">threshold = percentile(best_scores, 5)             // ≈ 0.7405</w:t>
+      </w:r>
+    </w:p>
+    <w:p>
+      <w:pPr>
+        <w:shd w:fill="F2F2F2" w:val="clear"/>
+        <w:spacing w:after="0" w:before="0"/>
+        <w:ind w:left="360"/>
+      </w:pPr>
+      <w:r>
+        <w:rPr>
+          <w:rFonts w:ascii="Courier New" w:cs="Courier New" w:eastAsia="Courier New" w:hAnsi="Courier New"/>
+          <w:color w:val="111111"/>
+          <w:sz w:val="18"/>
+          <w:szCs w:val="18"/>
+        </w:rPr>
+        <w:t xml:space="preserve"/>
+      </w:r>
+    </w:p>
+    <w:p>
+      <w:pPr>
+        <w:shd w:fill="F2F2F2" w:val="clear"/>
+        <w:spacing w:after="0" w:before="0"/>
+        <w:ind w:left="360"/>
+      </w:pPr>
+      <w:r>
+        <w:rPr>
+          <w:rFonts w:ascii="Courier New" w:cs="Courier New" w:eastAsia="Courier New" w:hAnsi="Courier New"/>
+          <w:color w:val="111111"/>
+          <w:sz w:val="18"/>
+          <w:szCs w:val="18"/>
+        </w:rPr>
+        <w:t xml:space="preserve">// ── PER-QUERY ──────────────────────────────────────────────────────</w:t>
+      </w:r>
+    </w:p>
+    <w:p>
+      <w:pPr>
+        <w:shd w:fill="F2F2F2" w:val="clear"/>
+        <w:spacing w:after="0" w:before="0"/>
+        <w:ind w:left="360"/>
+      </w:pPr>
+      <w:r>
+        <w:rPr>
+          <w:rFonts w:ascii="Courier New" w:cs="Courier New" w:eastAsia="Courier New" w:hAnsi="Courier New"/>
+          <w:color w:val="111111"/>
+          <w:sz w:val="18"/>
+          <w:szCs w:val="18"/>
+        </w:rPr>
+        <w:t xml:space="preserve">FUNCTION recommend(user_query):</w:t>
+      </w:r>
+    </w:p>
+    <w:p>
+      <w:pPr>
+        <w:shd w:fill="F2F2F2" w:val="clear"/>
+        <w:spacing w:after="0" w:before="0"/>
+        <w:ind w:left="360"/>
+      </w:pPr>
+      <w:r>
+        <w:rPr>
+          <w:rFonts w:ascii="Courier New" w:cs="Courier New" w:eastAsia="Courier New" w:hAnsi="Courier New"/>
+          <w:color w:val="111111"/>
+          <w:sz w:val="18"/>
+          <w:szCs w:val="18"/>
+        </w:rPr>
+        <w:t xml:space="preserve"/>
+      </w:r>
+    </w:p>
+    <w:p>
+      <w:pPr>
+        <w:shd w:fill="F2F2F2" w:val="clear"/>
+        <w:spacing w:after="0" w:before="0"/>
+        <w:ind w:left="360"/>
+      </w:pPr>
+      <w:r>
+        <w:rPr>
+          <w:rFonts w:ascii="Courier New" w:cs="Courier New" w:eastAsia="Courier New" w:hAnsi="Courier New"/>
+          <w:color w:val="111111"/>
+          <w:sz w:val="18"/>
+          <w:szCs w:val="18"/>
+        </w:rPr>
+        <w:t xml:space="preserve">  // Step 1 — LLM intent parsing (with prompt cache)</w:t>
+      </w:r>
+    </w:p>
+    <w:p>
+      <w:pPr>
+        <w:shd w:fill="F2F2F2" w:val="clear"/>
+        <w:spacing w:after="0" w:before="0"/>
+        <w:ind w:left="360"/>
+      </w:pPr>
+      <w:r>
+        <w:rPr>
+          <w:rFonts w:ascii="Courier New" w:cs="Courier New" w:eastAsia="Courier New" w:hAnsi="Courier New"/>
+          <w:color w:val="111111"/>
+          <w:sz w:val="18"/>
+          <w:szCs w:val="18"/>
+        </w:rPr>
+        <w:t xml:space="preserve">  TRY:</w:t>
+      </w:r>
+    </w:p>
+    <w:p>
+      <w:pPr>
+        <w:shd w:fill="F2F2F2" w:val="clear"/>
+        <w:spacing w:after="0" w:before="0"/>
+        <w:ind w:left="360"/>
+      </w:pPr>
+      <w:r>
+        <w:rPr>
+          <w:rFonts w:ascii="Courier New" w:cs="Courier New" w:eastAsia="Courier New" w:hAnsi="Courier New"/>
+          <w:color w:val="111111"/>
+          <w:sz w:val="18"/>
+          <w:szCs w:val="18"/>
+        </w:rPr>
+        <w:t xml:space="preserve">    intent = Claude.parse(user_query, system_prompt=PARSER_SYSTEM,</w:t>
+      </w:r>
+    </w:p>
+    <w:p>
+      <w:pPr>
+        <w:shd w:fill="F2F2F2" w:val="clear"/>
+        <w:spacing w:after="0" w:before="0"/>
+        <w:ind w:left="360"/>
+      </w:pPr>
+      <w:r>
+        <w:rPr>
+          <w:rFonts w:ascii="Courier New" w:cs="Courier New" w:eastAsia="Courier New" w:hAnsi="Courier New"/>
+          <w:color w:val="111111"/>
+          <w:sz w:val="18"/>
+          <w:szCs w:val="18"/>
+        </w:rPr>
+        <w:t xml:space="preserve">                          cache_control='ephemeral')</w:t>
+      </w:r>
+    </w:p>
+    <w:p>
+      <w:pPr>
+        <w:shd w:fill="F2F2F2" w:val="clear"/>
+        <w:spacing w:after="0" w:before="0"/>
+        <w:ind w:left="360"/>
+      </w:pPr>
+      <w:r>
+        <w:rPr>
+          <w:rFonts w:ascii="Courier New" w:cs="Courier New" w:eastAsia="Courier New" w:hAnsi="Courier New"/>
+          <w:color w:val="111111"/>
+          <w:sz w:val="18"/>
+          <w:szCs w:val="18"/>
+        </w:rPr>
+        <w:t xml:space="preserve">  EXCEPT (no_api_key OR rate_limit):</w:t>
+      </w:r>
+    </w:p>
+    <w:p>
+      <w:pPr>
+        <w:shd w:fill="F2F2F2" w:val="clear"/>
+        <w:spacing w:after="0" w:before="0"/>
+        <w:ind w:left="360"/>
+      </w:pPr>
+      <w:r>
+        <w:rPr>
+          <w:rFonts w:ascii="Courier New" w:cs="Courier New" w:eastAsia="Courier New" w:hAnsi="Courier New"/>
+          <w:color w:val="111111"/>
+          <w:sz w:val="18"/>
+          <w:szCs w:val="18"/>
+        </w:rPr>
+        <w:t xml:space="preserve">    intent = regex_fallback_parse(user_query)</w:t>
+      </w:r>
+    </w:p>
+    <w:p>
+      <w:pPr>
+        <w:shd w:fill="F2F2F2" w:val="clear"/>
+        <w:spacing w:after="0" w:before="0"/>
+        <w:ind w:left="360"/>
+      </w:pPr>
+      <w:r>
+        <w:rPr>
+          <w:rFonts w:ascii="Courier New" w:cs="Courier New" w:eastAsia="Courier New" w:hAnsi="Courier New"/>
+          <w:color w:val="111111"/>
+          <w:sz w:val="18"/>
+          <w:szCs w:val="18"/>
+        </w:rPr>
+        <w:t xml:space="preserve"/>
+      </w:r>
+    </w:p>
+    <w:p>
+      <w:pPr>
+        <w:shd w:fill="F2F2F2" w:val="clear"/>
+        <w:spacing w:after="0" w:before="0"/>
+        <w:ind w:left="360"/>
+      </w:pPr>
+      <w:r>
+        <w:rPr>
+          <w:rFonts w:ascii="Courier New" w:cs="Courier New" w:eastAsia="Courier New" w:hAnsi="Courier New"/>
+          <w:color w:val="111111"/>
+          <w:sz w:val="18"/>
+          <w:szCs w:val="18"/>
+        </w:rPr>
+        <w:t xml:space="preserve">  intent = {seeds, mood, length_pref, lang, free_text}</w:t>
+      </w:r>
+    </w:p>
+    <w:p>
+      <w:pPr>
+        <w:shd w:fill="F2F2F2" w:val="clear"/>
+        <w:spacing w:after="0" w:before="0"/>
+        <w:ind w:left="360"/>
+      </w:pPr>
+      <w:r>
+        <w:rPr>
+          <w:rFonts w:ascii="Courier New" w:cs="Courier New" w:eastAsia="Courier New" w:hAnsi="Courier New"/>
+          <w:color w:val="111111"/>
+          <w:sz w:val="18"/>
+          <w:szCs w:val="18"/>
+        </w:rPr>
+        <w:t xml:space="preserve"/>
+      </w:r>
+    </w:p>
+    <w:p>
+      <w:pPr>
+        <w:shd w:fill="F2F2F2" w:val="clear"/>
+        <w:spacing w:after="0" w:before="0"/>
+        <w:ind w:left="360"/>
+      </w:pPr>
+      <w:r>
+        <w:rPr>
+          <w:rFonts w:ascii="Courier New" w:cs="Courier New" w:eastAsia="Courier New" w:hAnsi="Courier New"/>
+          <w:color w:val="111111"/>
+          <w:sz w:val="18"/>
+          <w:szCs w:val="18"/>
+        </w:rPr>
+        <w:t xml:space="preserve">  // Step 2 — Bias mitigation per detected language (Section 8)</w:t>
+      </w:r>
+    </w:p>
+    <w:p>
+      <w:pPr>
+        <w:shd w:fill="F2F2F2" w:val="clear"/>
+        <w:spacing w:after="0" w:before="0"/>
+        <w:ind w:left="360"/>
+      </w:pPr>
+      <w:r>
+        <w:rPr>
+          <w:rFonts w:ascii="Courier New" w:cs="Courier New" w:eastAsia="Courier New" w:hAnsi="Courier New"/>
+          <w:color w:val="111111"/>
+          <w:sz w:val="18"/>
+          <w:szCs w:val="18"/>
+        </w:rPr>
+        <w:t xml:space="preserve">  IF intent.lang == 'he':</w:t>
+      </w:r>
+    </w:p>
+    <w:p>
+      <w:pPr>
+        <w:shd w:fill="F2F2F2" w:val="clear"/>
+        <w:spacing w:after="0" w:before="0"/>
+        <w:ind w:left="360"/>
+      </w:pPr>
+      <w:r>
+        <w:rPr>
+          <w:rFonts w:ascii="Courier New" w:cs="Courier New" w:eastAsia="Courier New" w:hAnsi="Courier New"/>
+          <w:color w:val="111111"/>
+          <w:sz w:val="18"/>
+          <w:szCs w:val="18"/>
+        </w:rPr>
+        <w:t xml:space="preserve">    α, β, γ = 0.50, 0.30, 0.20   // up-weight Jaccard for Hebrew</w:t>
+      </w:r>
+    </w:p>
+    <w:p>
+      <w:pPr>
+        <w:shd w:fill="F2F2F2" w:val="clear"/>
+        <w:spacing w:after="0" w:before="0"/>
+        <w:ind w:left="360"/>
+      </w:pPr>
+      <w:r>
+        <w:rPr>
+          <w:rFonts w:ascii="Courier New" w:cs="Courier New" w:eastAsia="Courier New" w:hAnsi="Courier New"/>
+          <w:color w:val="111111"/>
+          <w:sz w:val="18"/>
+          <w:szCs w:val="18"/>
+        </w:rPr>
+        <w:t xml:space="preserve">  ELSE:</w:t>
+      </w:r>
+    </w:p>
+    <w:p>
+      <w:pPr>
+        <w:shd w:fill="F2F2F2" w:val="clear"/>
+        <w:spacing w:after="0" w:before="0"/>
+        <w:ind w:left="360"/>
+      </w:pPr>
+      <w:r>
+        <w:rPr>
+          <w:rFonts w:ascii="Courier New" w:cs="Courier New" w:eastAsia="Courier New" w:hAnsi="Courier New"/>
+          <w:color w:val="111111"/>
+          <w:sz w:val="18"/>
+          <w:szCs w:val="18"/>
+        </w:rPr>
+        <w:t xml:space="preserve">    α, β, γ = 0.35, 0.30, 0.35</w:t>
+      </w:r>
+    </w:p>
+    <w:p>
+      <w:pPr>
+        <w:shd w:fill="F2F2F2" w:val="clear"/>
+        <w:spacing w:after="0" w:before="0"/>
+        <w:ind w:left="360"/>
+      </w:pPr>
+      <w:r>
+        <w:rPr>
+          <w:rFonts w:ascii="Courier New" w:cs="Courier New" w:eastAsia="Courier New" w:hAnsi="Courier New"/>
+          <w:color w:val="111111"/>
+          <w:sz w:val="18"/>
+          <w:szCs w:val="18"/>
+        </w:rPr>
+        <w:t xml:space="preserve"/>
+      </w:r>
+    </w:p>
+    <w:p>
+      <w:pPr>
+        <w:shd w:fill="F2F2F2" w:val="clear"/>
+        <w:spacing w:after="0" w:before="0"/>
+        <w:ind w:left="360"/>
+      </w:pPr>
+      <w:r>
+        <w:rPr>
+          <w:rFonts w:ascii="Courier New" w:cs="Courier New" w:eastAsia="Courier New" w:hAnsi="Courier New"/>
+          <w:color w:val="111111"/>
+          <w:sz w:val="18"/>
+          <w:szCs w:val="18"/>
+        </w:rPr>
+        <w:t xml:space="preserve">  // Step 3 — Embed user query</w:t>
+      </w:r>
+    </w:p>
+    <w:p>
+      <w:pPr>
+        <w:shd w:fill="F2F2F2" w:val="clear"/>
+        <w:spacing w:after="0" w:before="0"/>
+        <w:ind w:left="360"/>
+      </w:pPr>
+      <w:r>
+        <w:rPr>
+          <w:rFonts w:ascii="Courier New" w:cs="Courier New" w:eastAsia="Courier New" w:hAnsi="Courier New"/>
+          <w:color w:val="111111"/>
+          <w:sz w:val="18"/>
+          <w:szCs w:val="18"/>
+        </w:rPr>
+        <w:t xml:space="preserve">  q_emb = SentenceTransformer.encode(user_query, l2_normalize=True)</w:t>
+      </w:r>
+    </w:p>
+    <w:p>
+      <w:pPr>
+        <w:shd w:fill="F2F2F2" w:val="clear"/>
+        <w:spacing w:after="0" w:before="0"/>
+        <w:ind w:left="360"/>
+      </w:pPr>
+      <w:r>
+        <w:rPr>
+          <w:rFonts w:ascii="Courier New" w:cs="Courier New" w:eastAsia="Courier New" w:hAnsi="Courier New"/>
+          <w:color w:val="111111"/>
+          <w:sz w:val="18"/>
+          <w:szCs w:val="18"/>
+        </w:rPr>
+        <w:t xml:space="preserve"/>
+      </w:r>
+    </w:p>
+    <w:p>
+      <w:pPr>
+        <w:shd w:fill="F2F2F2" w:val="clear"/>
+        <w:spacing w:after="0" w:before="0"/>
+        <w:ind w:left="360"/>
+      </w:pPr>
+      <w:r>
+        <w:rPr>
+          <w:rFonts w:ascii="Courier New" w:cs="Courier New" w:eastAsia="Courier New" w:hAnsi="Courier New"/>
+          <w:color w:val="111111"/>
+          <w:sz w:val="18"/>
+          <w:szCs w:val="18"/>
+        </w:rPr>
+        <w:t xml:space="preserve">  // Step 4 — Build candidate pool</w:t>
+      </w:r>
+    </w:p>
+    <w:p>
+      <w:pPr>
+        <w:shd w:fill="F2F2F2" w:val="clear"/>
+        <w:spacing w:after="0" w:before="0"/>
+        <w:ind w:left="360"/>
+      </w:pPr>
+      <w:r>
+        <w:rPr>
+          <w:rFonts w:ascii="Courier New" w:cs="Courier New" w:eastAsia="Courier New" w:hAnsi="Courier New"/>
+          <w:color w:val="111111"/>
+          <w:sz w:val="18"/>
+          <w:szCs w:val="18"/>
+        </w:rPr>
+        <w:t xml:space="preserve">  IF intent.seeds NOT EMPTY:</w:t>
+      </w:r>
+    </w:p>
+    <w:p>
+      <w:pPr>
+        <w:shd w:fill="F2F2F2" w:val="clear"/>
+        <w:spacing w:after="0" w:before="0"/>
+        <w:ind w:left="360"/>
+      </w:pPr>
+      <w:r>
+        <w:rPr>
+          <w:rFonts w:ascii="Courier New" w:cs="Courier New" w:eastAsia="Courier New" w:hAnsi="Courier New"/>
+          <w:color w:val="111111"/>
+          <w:sz w:val="18"/>
+          <w:szCs w:val="18"/>
+        </w:rPr>
+        <w:t xml:space="preserve">    j_pool = topK_by_jaccard(seeds[0], catalog, k=100)</w:t>
+      </w:r>
+    </w:p>
+    <w:p>
+      <w:pPr>
+        <w:shd w:fill="F2F2F2" w:val="clear"/>
+        <w:spacing w:after="0" w:before="0"/>
+        <w:ind w:left="360"/>
+      </w:pPr>
+      <w:r>
+        <w:rPr>
+          <w:rFonts w:ascii="Courier New" w:cs="Courier New" w:eastAsia="Courier New" w:hAnsi="Courier New"/>
+          <w:color w:val="111111"/>
+          <w:sz w:val="18"/>
+          <w:szCs w:val="18"/>
+        </w:rPr>
+        <w:t xml:space="preserve">    n_pool = topK_by_numeric_cosine(seeds[0], M_num, k=100)</w:t>
+      </w:r>
+    </w:p>
+    <w:p>
+      <w:pPr>
+        <w:shd w:fill="F2F2F2" w:val="clear"/>
+        <w:spacing w:after="0" w:before="0"/>
+        <w:ind w:left="360"/>
+      </w:pPr>
+      <w:r>
+        <w:rPr>
+          <w:rFonts w:ascii="Courier New" w:cs="Courier New" w:eastAsia="Courier New" w:hAnsi="Courier New"/>
+          <w:color w:val="111111"/>
+          <w:sz w:val="18"/>
+          <w:szCs w:val="18"/>
+        </w:rPr>
+        <w:t xml:space="preserve">  ELSE:</w:t>
+      </w:r>
+    </w:p>
+    <w:p>
+      <w:pPr>
+        <w:shd w:fill="F2F2F2" w:val="clear"/>
+        <w:spacing w:after="0" w:before="0"/>
+        <w:ind w:left="360"/>
+      </w:pPr>
+      <w:r>
+        <w:rPr>
+          <w:rFonts w:ascii="Courier New" w:cs="Courier New" w:eastAsia="Courier New" w:hAnsi="Courier New"/>
+          <w:color w:val="111111"/>
+          <w:sz w:val="18"/>
+          <w:szCs w:val="18"/>
+        </w:rPr>
+        <w:t xml:space="preserve">    j_pool, n_pool = ∅, ∅</w:t>
+      </w:r>
+    </w:p>
+    <w:p>
+      <w:pPr>
+        <w:shd w:fill="F2F2F2" w:val="clear"/>
+        <w:spacing w:after="0" w:before="0"/>
+        <w:ind w:left="360"/>
+      </w:pPr>
+      <w:r>
+        <w:rPr>
+          <w:rFonts w:ascii="Courier New" w:cs="Courier New" w:eastAsia="Courier New" w:hAnsi="Courier New"/>
+          <w:color w:val="111111"/>
+          <w:sz w:val="18"/>
+          <w:szCs w:val="18"/>
+        </w:rPr>
+        <w:t xml:space="preserve"/>
+      </w:r>
+    </w:p>
+    <w:p>
+      <w:pPr>
+        <w:shd w:fill="F2F2F2" w:val="clear"/>
+        <w:spacing w:after="0" w:before="0"/>
+        <w:ind w:left="360"/>
+      </w:pPr>
+      <w:r>
+        <w:rPr>
+          <w:rFonts w:ascii="Courier New" w:cs="Courier New" w:eastAsia="Courier New" w:hAnsi="Courier New"/>
+          <w:color w:val="111111"/>
+          <w:sz w:val="18"/>
+          <w:szCs w:val="18"/>
+        </w:rPr>
+        <w:t xml:space="preserve">  // Text cosine always runs (works with or without seed)</w:t>
+      </w:r>
+    </w:p>
+    <w:p>
+      <w:pPr>
+        <w:shd w:fill="F2F2F2" w:val="clear"/>
+        <w:spacing w:after="0" w:before="0"/>
+        <w:ind w:left="360"/>
+      </w:pPr>
+      <w:r>
+        <w:rPr>
+          <w:rFonts w:ascii="Courier New" w:cs="Courier New" w:eastAsia="Courier New" w:hAnsi="Courier New"/>
+          <w:color w:val="111111"/>
+          <w:sz w:val="18"/>
+          <w:szCs w:val="18"/>
+        </w:rPr>
+        <w:t xml:space="preserve">  t_pool = topK_by_text_cosine(q_emb @ embeddings.T, k=100)</w:t>
+      </w:r>
+    </w:p>
+    <w:p>
+      <w:pPr>
+        <w:shd w:fill="F2F2F2" w:val="clear"/>
+        <w:spacing w:after="0" w:before="0"/>
+        <w:ind w:left="360"/>
+      </w:pPr>
+      <w:r>
+        <w:rPr>
+          <w:rFonts w:ascii="Courier New" w:cs="Courier New" w:eastAsia="Courier New" w:hAnsi="Courier New"/>
+          <w:color w:val="111111"/>
+          <w:sz w:val="18"/>
+          <w:szCs w:val="18"/>
+        </w:rPr>
+        <w:t xml:space="preserve">  candidates = j_pool ∪ n_pool ∪ t_pool</w:t>
+      </w:r>
+    </w:p>
+    <w:p>
+      <w:pPr>
+        <w:shd w:fill="F2F2F2" w:val="clear"/>
+        <w:spacing w:after="0" w:before="0"/>
+        <w:ind w:left="360"/>
+      </w:pPr>
+      <w:r>
+        <w:rPr>
+          <w:rFonts w:ascii="Courier New" w:cs="Courier New" w:eastAsia="Courier New" w:hAnsi="Courier New"/>
+          <w:color w:val="111111"/>
+          <w:sz w:val="18"/>
+          <w:szCs w:val="18"/>
+        </w:rPr>
+        <w:t xml:space="preserve"/>
+      </w:r>
+    </w:p>
+    <w:p>
+      <w:pPr>
+        <w:shd w:fill="F2F2F2" w:val="clear"/>
+        <w:spacing w:after="0" w:before="0"/>
+        <w:ind w:left="360"/>
+      </w:pPr>
+      <w:r>
+        <w:rPr>
+          <w:rFonts w:ascii="Courier New" w:cs="Courier New" w:eastAsia="Courier New" w:hAnsi="Courier New"/>
+          <w:color w:val="111111"/>
+          <w:sz w:val="18"/>
+          <w:szCs w:val="18"/>
+        </w:rPr>
+        <w:t xml:space="preserve">  // Step 5 — Score every candidate with hybrid formula</w:t>
+      </w:r>
+    </w:p>
+    <w:p>
+      <w:pPr>
+        <w:shd w:fill="F2F2F2" w:val="clear"/>
+        <w:spacing w:after="0" w:before="0"/>
+        <w:ind w:left="360"/>
+      </w:pPr>
+      <w:r>
+        <w:rPr>
+          <w:rFonts w:ascii="Courier New" w:cs="Courier New" w:eastAsia="Courier New" w:hAnsi="Courier New"/>
+          <w:color w:val="111111"/>
+          <w:sz w:val="18"/>
+          <w:szCs w:val="18"/>
+        </w:rPr>
+        <w:t xml:space="preserve">  FOR each c IN candidates:</w:t>
+      </w:r>
+    </w:p>
+    <w:p>
+      <w:pPr>
+        <w:shd w:fill="F2F2F2" w:val="clear"/>
+        <w:spacing w:after="0" w:before="0"/>
+        <w:ind w:left="360"/>
+      </w:pPr>
+      <w:r>
+        <w:rPr>
+          <w:rFonts w:ascii="Courier New" w:cs="Courier New" w:eastAsia="Courier New" w:hAnsi="Courier New"/>
+          <w:color w:val="111111"/>
+          <w:sz w:val="18"/>
+          <w:szCs w:val="18"/>
+        </w:rPr>
+        <w:t xml:space="preserve">    score[c] = α·jaccard(seed,c) + β·M_num[seed,c]</w:t>
+      </w:r>
+    </w:p>
+    <w:p>
+      <w:pPr>
+        <w:shd w:fill="F2F2F2" w:val="clear"/>
+        <w:spacing w:after="0" w:before="0"/>
+        <w:ind w:left="360"/>
+      </w:pPr>
+      <w:r>
+        <w:rPr>
+          <w:rFonts w:ascii="Courier New" w:cs="Courier New" w:eastAsia="Courier New" w:hAnsi="Courier New"/>
+          <w:color w:val="111111"/>
+          <w:sz w:val="18"/>
+          <w:szCs w:val="18"/>
+        </w:rPr>
+        <w:t xml:space="preserve">              + γ·dot(q_emb, embeddings[c])</w:t>
+      </w:r>
+    </w:p>
+    <w:p>
+      <w:pPr>
+        <w:shd w:fill="F2F2F2" w:val="clear"/>
+        <w:spacing w:after="0" w:before="0"/>
+        <w:ind w:left="360"/>
+      </w:pPr>
+      <w:r>
+        <w:rPr>
+          <w:rFonts w:ascii="Courier New" w:cs="Courier New" w:eastAsia="Courier New" w:hAnsi="Courier New"/>
+          <w:color w:val="111111"/>
+          <w:sz w:val="18"/>
+          <w:szCs w:val="18"/>
+        </w:rPr>
+        <w:t xml:space="preserve"/>
+      </w:r>
+    </w:p>
+    <w:p>
+      <w:pPr>
+        <w:shd w:fill="F2F2F2" w:val="clear"/>
+        <w:spacing w:after="0" w:before="0"/>
+        <w:ind w:left="360"/>
+      </w:pPr>
+      <w:r>
+        <w:rPr>
+          <w:rFonts w:ascii="Courier New" w:cs="Courier New" w:eastAsia="Courier New" w:hAnsi="Courier New"/>
+          <w:color w:val="111111"/>
+          <w:sz w:val="18"/>
+          <w:szCs w:val="18"/>
+        </w:rPr>
+        <w:t xml:space="preserve">  // Step 6 — Anomaly gate</w:t>
+      </w:r>
+    </w:p>
+    <w:p>
+      <w:pPr>
+        <w:shd w:fill="F2F2F2" w:val="clear"/>
+        <w:spacing w:after="0" w:before="0"/>
+        <w:ind w:left="360"/>
+      </w:pPr>
+      <w:r>
+        <w:rPr>
+          <w:rFonts w:ascii="Courier New" w:cs="Courier New" w:eastAsia="Courier New" w:hAnsi="Courier New"/>
+          <w:color w:val="111111"/>
+          <w:sz w:val="18"/>
+          <w:szCs w:val="18"/>
+        </w:rPr>
+        <w:t xml:space="preserve">  IF max(score) &lt; threshold:</w:t>
+      </w:r>
+    </w:p>
+    <w:p>
+      <w:pPr>
+        <w:shd w:fill="F2F2F2" w:val="clear"/>
+        <w:spacing w:after="0" w:before="0"/>
+        <w:ind w:left="360"/>
+      </w:pPr>
+      <w:r>
+        <w:rPr>
+          <w:rFonts w:ascii="Courier New" w:cs="Courier New" w:eastAsia="Courier New" w:hAnsi="Courier New"/>
+          <w:color w:val="111111"/>
+          <w:sz w:val="18"/>
+          <w:szCs w:val="18"/>
+        </w:rPr>
+        <w:t xml:space="preserve">    RETURN anomaly_warning_in(intent.lang)</w:t>
+      </w:r>
+    </w:p>
+    <w:p>
+      <w:pPr>
+        <w:shd w:fill="F2F2F2" w:val="clear"/>
+        <w:spacing w:after="0" w:before="0"/>
+        <w:ind w:left="360"/>
+      </w:pPr>
+      <w:r>
+        <w:rPr>
+          <w:rFonts w:ascii="Courier New" w:cs="Courier New" w:eastAsia="Courier New" w:hAnsi="Courier New"/>
+          <w:color w:val="111111"/>
+          <w:sz w:val="18"/>
+          <w:szCs w:val="18"/>
+        </w:rPr>
+        <w:t xml:space="preserve"/>
+      </w:r>
+    </w:p>
+    <w:p>
+      <w:pPr>
+        <w:shd w:fill="F2F2F2" w:val="clear"/>
+        <w:spacing w:after="0" w:before="0"/>
+        <w:ind w:left="360"/>
+      </w:pPr>
+      <w:r>
+        <w:rPr>
+          <w:rFonts w:ascii="Courier New" w:cs="Courier New" w:eastAsia="Courier New" w:hAnsi="Courier New"/>
+          <w:color w:val="111111"/>
+          <w:sz w:val="18"/>
+          <w:szCs w:val="18"/>
+        </w:rPr>
+        <w:t xml:space="preserve">  // Step 7 — Select top-5 and generate explanation</w:t>
+      </w:r>
+    </w:p>
+    <w:p>
+      <w:pPr>
+        <w:shd w:fill="F2F2F2" w:val="clear"/>
+        <w:spacing w:after="0" w:before="0"/>
+        <w:ind w:left="360"/>
+      </w:pPr>
+      <w:r>
+        <w:rPr>
+          <w:rFonts w:ascii="Courier New" w:cs="Courier New" w:eastAsia="Courier New" w:hAnsi="Courier New"/>
+          <w:color w:val="111111"/>
+          <w:sz w:val="18"/>
+          <w:szCs w:val="18"/>
+        </w:rPr>
+        <w:t xml:space="preserve">  top5 = sort_desc(candidates by score)[:5]</w:t>
+      </w:r>
+    </w:p>
+    <w:p>
+      <w:pPr>
+        <w:shd w:fill="F2F2F2" w:val="clear"/>
+        <w:spacing w:after="0" w:before="0"/>
+        <w:ind w:left="360"/>
+      </w:pPr>
+      <w:r>
+        <w:rPr>
+          <w:rFonts w:ascii="Courier New" w:cs="Courier New" w:eastAsia="Courier New" w:hAnsi="Courier New"/>
+          <w:color w:val="111111"/>
+          <w:sz w:val="18"/>
+          <w:szCs w:val="18"/>
+        </w:rPr>
+        <w:t xml:space="preserve"/>
+      </w:r>
+    </w:p>
+    <w:p>
+      <w:pPr>
+        <w:shd w:fill="F2F2F2" w:val="clear"/>
+        <w:spacing w:after="0" w:before="0"/>
+        <w:ind w:left="360"/>
+      </w:pPr>
+      <w:r>
+        <w:rPr>
+          <w:rFonts w:ascii="Courier New" w:cs="Courier New" w:eastAsia="Courier New" w:hAnsi="Courier New"/>
+          <w:color w:val="111111"/>
+          <w:sz w:val="18"/>
+          <w:szCs w:val="18"/>
+        </w:rPr>
+        <w:t xml:space="preserve">  TRY:</w:t>
+      </w:r>
+    </w:p>
+    <w:p>
+      <w:pPr>
+        <w:shd w:fill="F2F2F2" w:val="clear"/>
+        <w:spacing w:after="0" w:before="0"/>
+        <w:ind w:left="360"/>
+      </w:pPr>
+      <w:r>
+        <w:rPr>
+          <w:rFonts w:ascii="Courier New" w:cs="Courier New" w:eastAsia="Courier New" w:hAnsi="Courier New"/>
+          <w:color w:val="111111"/>
+          <w:sz w:val="18"/>
+          <w:szCs w:val="18"/>
+        </w:rPr>
+        <w:t xml:space="preserve">    explanation = Claude.explain(intent, top5,</w:t>
+      </w:r>
+    </w:p>
+    <w:p>
+      <w:pPr>
+        <w:shd w:fill="F2F2F2" w:val="clear"/>
+        <w:spacing w:after="0" w:before="0"/>
+        <w:ind w:left="360"/>
+      </w:pPr>
+      <w:r>
+        <w:rPr>
+          <w:rFonts w:ascii="Courier New" w:cs="Courier New" w:eastAsia="Courier New" w:hAnsi="Courier New"/>
+          <w:color w:val="111111"/>
+          <w:sz w:val="18"/>
+          <w:szCs w:val="18"/>
+        </w:rPr>
+        <w:t xml:space="preserve">                                 system_prompt=EXPLAINER_SYSTEM,</w:t>
+      </w:r>
+    </w:p>
+    <w:p>
+      <w:pPr>
+        <w:shd w:fill="F2F2F2" w:val="clear"/>
+        <w:spacing w:after="0" w:before="0"/>
+        <w:ind w:left="360"/>
+      </w:pPr>
+      <w:r>
+        <w:rPr>
+          <w:rFonts w:ascii="Courier New" w:cs="Courier New" w:eastAsia="Courier New" w:hAnsi="Courier New"/>
+          <w:color w:val="111111"/>
+          <w:sz w:val="18"/>
+          <w:szCs w:val="18"/>
+        </w:rPr>
+        <w:t xml:space="preserve">                                 cache_control='ephemeral',</w:t>
+      </w:r>
+    </w:p>
+    <w:p>
+      <w:pPr>
+        <w:shd w:fill="F2F2F2" w:val="clear"/>
+        <w:spacing w:after="0" w:before="0"/>
+        <w:ind w:left="360"/>
+      </w:pPr>
+      <w:r>
+        <w:rPr>
+          <w:rFonts w:ascii="Courier New" w:cs="Courier New" w:eastAsia="Courier New" w:hAnsi="Courier New"/>
+          <w:color w:val="111111"/>
+          <w:sz w:val="18"/>
+          <w:szCs w:val="18"/>
+        </w:rPr>
+        <w:t xml:space="preserve">                                 output_lang=intent.lang)</w:t>
+      </w:r>
+    </w:p>
+    <w:p>
+      <w:pPr>
+        <w:shd w:fill="F2F2F2" w:val="clear"/>
+        <w:spacing w:after="0" w:before="0"/>
+        <w:ind w:left="360"/>
+      </w:pPr>
+      <w:r>
+        <w:rPr>
+          <w:rFonts w:ascii="Courier New" w:cs="Courier New" w:eastAsia="Courier New" w:hAnsi="Courier New"/>
+          <w:color w:val="111111"/>
+          <w:sz w:val="18"/>
+          <w:szCs w:val="18"/>
+        </w:rPr>
+        <w:t xml:space="preserve">  EXCEPT:</w:t>
+      </w:r>
+    </w:p>
+    <w:p>
+      <w:pPr>
+        <w:shd w:fill="F2F2F2" w:val="clear"/>
+        <w:spacing w:after="0" w:before="0"/>
+        <w:ind w:left="360"/>
+      </w:pPr>
+      <w:r>
+        <w:rPr>
+          <w:rFonts w:ascii="Courier New" w:cs="Courier New" w:eastAsia="Courier New" w:hAnsi="Courier New"/>
+          <w:color w:val="111111"/>
+          <w:sz w:val="18"/>
+          <w:szCs w:val="18"/>
+        </w:rPr>
+        <w:t xml:space="preserve">    explanation = template_explanation(top5, intent.lang)</w:t>
+      </w:r>
+    </w:p>
+    <w:p>
+      <w:pPr>
+        <w:shd w:fill="F2F2F2" w:val="clear"/>
+        <w:spacing w:after="0" w:before="0"/>
+        <w:ind w:left="360"/>
+      </w:pPr>
+      <w:r>
+        <w:rPr>
+          <w:rFonts w:ascii="Courier New" w:cs="Courier New" w:eastAsia="Courier New" w:hAnsi="Courier New"/>
+          <w:color w:val="111111"/>
+          <w:sz w:val="18"/>
+          <w:szCs w:val="18"/>
+        </w:rPr>
+        <w:t xml:space="preserve"/>
+      </w:r>
+    </w:p>
+    <w:p>
+      <w:pPr>
+        <w:shd w:fill="F2F2F2" w:val="clear"/>
+        <w:spacing w:after="0" w:before="0"/>
+        <w:ind w:left="360"/>
+      </w:pPr>
+      <w:r>
+        <w:rPr>
+          <w:rFonts w:ascii="Courier New" w:cs="Courier New" w:eastAsia="Courier New" w:hAnsi="Courier New"/>
+          <w:color w:val="111111"/>
+          <w:sz w:val="18"/>
+          <w:szCs w:val="18"/>
+        </w:rPr>
+        <w:t xml:space="preserve">  RETURN top5, explanation, scores_breakdown</w:t>
+      </w:r>
+    </w:p>
+    <w:p>
+      <w:pPr>
+        <w:spacing w:after="60" w:before="60"/>
+      </w:pPr>
+      <w:r>
+        <w:t xml:space="preserve"/>
+      </w:r>
+    </w:p>
+    <w:p>
+      <w:pPr>
+        <w:pStyle w:val="Heading2"/>
+        <w:spacing w:after="100" w:before="200"/>
+      </w:pPr>
+      <w:r>
+        <w:rPr>
+          <w:rFonts w:ascii="Arial" w:cs="Arial" w:eastAsia="Arial" w:hAnsi="Arial"/>
+          <w:b/>
+          <w:bCs/>
+          <w:color w:val="1A3560"/>
+          <w:sz w:val="24"/>
+          <w:szCs w:val="24"/>
+        </w:rPr>
+        <w:t xml:space="preserve">5.6 Sample Outputs</w:t>
       </w:r>
     </w:p>
     <w:p>
@@ -5024,7 +7533,7 @@
           <w:sz w:val="28"/>
           <w:szCs w:val="28"/>
         </w:rPr>
-        <w:t xml:space="preserve">8. Ethical Considerations</w:t>
+        <w:t xml:space="preserve">8. Ethical Considerations &amp; Mitigations Implemented</w:t>
       </w:r>
     </w:p>
     <w:p>
@@ -5039,7 +7548,7 @@
           <w:sz w:val="22"/>
           <w:szCs w:val="22"/>
         </w:rPr>
-        <w:t xml:space="preserve">Bias 1 — Popularity Bias:</w:t>
+        <w:t xml:space="preserve">Bias 1 — Popularity Bias (acknowledged):</w:t>
       </w:r>
     </w:p>
     <w:p>
@@ -5052,7 +7561,7 @@
           <w:sz w:val="22"/>
           <w:szCs w:val="22"/>
         </w:rPr>
-        <w:t xml:space="preserve">All shows with fewer than 10 votes were dropped — a threshold that systematically excludes niche content, independent productions, and non-English-language shows. The recommendation engine under-recommends minority-language content even when it would be a strong genre match. Mitigation: surface a 'Hidden Gems' tier (high rating, low votes) alongside mainstream recommendations.</w:t>
+        <w:t xml:space="preserve">All shows with fewer than 10 votes were dropped — a threshold that systematically excludes niche content, independent productions, and non-English-language shows. The recommendation engine under-recommends minority-language content even when it would be a strong genre match. Mitigation (planned for v2): surface a 'Hidden Gems' tier (high rating, low votes) alongside mainstream recommendations.</w:t>
       </w:r>
     </w:p>
     <w:p>
@@ -5075,7 +7584,7 @@
           <w:sz w:val="22"/>
           <w:szCs w:val="22"/>
         </w:rPr>
-        <w:t xml:space="preserve">Bias 2 — English-Language Embedding Bias:</w:t>
+        <w:t xml:space="preserve">Bias 2 — English-Language Embedding Bias (IMPLEMENTED):</w:t>
       </w:r>
     </w:p>
     <w:p>
@@ -5088,7 +7597,7 @@
           <w:sz w:val="22"/>
           <w:szCs w:val="22"/>
         </w:rPr>
-        <w:t xml:space="preserve">The multilingual model performs best on English text; Hebrew representation quality is lower. Plot synopses in the catalog are predominantly English. A Hebrew user's query is embedded well, but candidate synopses are mostly English — creating an asymmetry that may disadvantage Hebrew-language shows. Mitigation: up-weight Jaccard (genre-based) and down-weight text-cosine for detected Hebrew queries.</w:t>
+        <w:t xml:space="preserve">The multilingual model performs best on English text; Hebrew representation quality is lower. The agent now detects the query language and re-weights the hybrid formula automatically: for Hebrew queries the weights shift to α=0.50, β=0.30, γ=0.20 (up-weighting language-neutral Jaccard, down-weighting English-dominant text cosine). For English the original α=0.35, β=0.30, γ=0.35 stands. This is in engine/hybrid.py (HEBREW_WEIGHTS constant) and routes via the query_lang argument in app.py's run_search().</w:t>
       </w:r>
     </w:p>
     <w:p>
@@ -5111,7 +7620,7 @@
           <w:sz w:val="22"/>
           <w:szCs w:val="22"/>
         </w:rPr>
-        <w:t xml:space="preserve">Bias 3 — Recency Bias:</w:t>
+        <w:t xml:space="preserve">Bias 3 — Recency Bias (IMPLEMENTED):</w:t>
       </w:r>
     </w:p>
     <w:p>
@@ -5124,7 +7633,7 @@
           <w:sz w:val="22"/>
           <w:szCs w:val="22"/>
         </w:rPr>
-        <w:t xml:space="preserve">The binge_fit_score formula (replicated from Assignment 1) awards a bonus point to 2010s/2020s shows. Older classic shows (1970s–1990s) may be ranked lower than newer shows with similar quality. Mitigation: remove the recency bonus from the ranking score; keep it as a display label only.</w:t>
+        <w:t xml:space="preserve">The binge_fit_score with its +1 recency bonus is now used only as a display label (the 'binge_fit_score' column in the catalog), not as part of any ranking calculation. Ranking is computed purely from Jaccard, Cosine-numeric, and Cosine-text — none of which include a hand-coded recency boost. Verified by grep-ing engine/ for binge_fit_score: zero references in scoring code.</w:t>
       </w:r>
     </w:p>
     <w:p>
@@ -5716,7 +8225,7 @@
                 <w:sz w:val="18"/>
                 <w:szCs w:val="18"/>
               </w:rPr>
-              <w:t xml:space="preserve">Render.com: https://antenna-sending-metric-fantasy.trycloudflare.com</w:t>
+              <w:t xml:space="preserve">Render.com (URL in README — to be filled at submission time)</w:t>
             </w:r>
           </w:p>
         </w:tc>
@@ -5940,7 +8449,63 @@
                 <w:sz w:val="18"/>
                 <w:szCs w:val="18"/>
               </w:rPr>
-              <w:t xml:space="preserve">evaluation_results.json — Spearman, Agreement@K, Precision@5</w:t>
+              <w:t xml:space="preserve">evaluation_results.json — Spearman, Agreement@K, Precision@5 (incl. 3 baselines)</w:t>
+            </w:r>
+          </w:p>
+        </w:tc>
+      </w:tr>
+      <w:tr>
+        <w:tc>
+          <w:tcPr>
+            <w:tcW w:type="dxa" w:w="3000"/>
+            <w:tcBorders>
+              <w:top w:val="single" w:color="CCCCCC" w:sz="4"/>
+              <w:left w:val="single" w:color="CCCCCC" w:sz="4"/>
+              <w:bottom w:val="single" w:color="CCCCCC" w:sz="4"/>
+              <w:right w:val="single" w:color="CCCCCC" w:sz="4"/>
+            </w:tcBorders>
+            <w:tcMar>
+              <w:top w:type="dxa" w:w="60"/>
+              <w:left w:type="dxa" w:w="120"/>
+              <w:bottom w:type="dxa" w:w="60"/>
+              <w:right w:type="dxa" w:w="120"/>
+            </w:tcMar>
+          </w:tcPr>
+          <w:p>
+            <w:r>
+              <w:rPr>
+                <w:rFonts w:ascii="Arial" w:cs="Arial" w:eastAsia="Arial" w:hAnsi="Arial"/>
+                <w:sz w:val="18"/>
+                <w:szCs w:val="18"/>
+              </w:rPr>
+              <w:t xml:space="preserve">Trend analysis</w:t>
+            </w:r>
+          </w:p>
+        </w:tc>
+        <w:tc>
+          <w:tcPr>
+            <w:tcW w:type="dxa" w:w="6360"/>
+            <w:tcBorders>
+              <w:top w:val="single" w:color="CCCCCC" w:sz="4"/>
+              <w:left w:val="single" w:color="CCCCCC" w:sz="4"/>
+              <w:bottom w:val="single" w:color="CCCCCC" w:sz="4"/>
+              <w:right w:val="single" w:color="CCCCCC" w:sz="4"/>
+            </w:tcBorders>
+            <w:tcMar>
+              <w:top w:type="dxa" w:w="60"/>
+              <w:left w:type="dxa" w:w="120"/>
+              <w:bottom w:type="dxa" w:w="60"/>
+              <w:right w:type="dxa" w:w="120"/>
+            </w:tcMar>
+          </w:tcPr>
+          <w:p>
+            <w:r>
+              <w:rPr>
+                <w:rFonts w:ascii="Arial" w:cs="Arial" w:eastAsia="Arial" w:hAnsi="Arial"/>
+                <w:sz w:val="18"/>
+                <w:szCs w:val="18"/>
+              </w:rPr>
+              <w:t xml:space="preserve">trends.json — rising/declining genres, decade quality, Shannon entropy</w:t>
             </w:r>
           </w:p>
         </w:tc>

</xml_diff>